<commit_message>
Revise methodology summary to present fgsea as the sole GSEA tool
Drop the hand-rolled/validation framing from the presentation-facing
document per user request (non-technical audience). Replace all KEGG
pathway-level numbers with fgsea's own real results throughout, add a
resolved shared-pathway direction table (including the previously
NA-direction ECM pathways), and add a plain-language explanation of
each fgsea output column (ES, NES, pval, padj, log2err, leadingEdge).

Co-Authored-By: Claude Sonnet 5 <noreply@anthropic.com>
Claude-Session: https://claude.ai/code/session_01XefZbDhwpQL5kugpVCCZQL
</commit_message>
<xml_diff>
--- a/POP_SUI_DEG_GSEA_EN/Resumo_Metodologico_POP_SUI.docx
+++ b/POP_SUI_DEG_GSEA_EN/Resumo_Metodologico_POP_SUI.docx
@@ -786,7 +786,7 @@
                 <w:sz w:val="19"/>
                 <w:szCs w:val="19"/>
               </w:rPr>
-              <w:t xml:space="preserve">"limma" é um pacote originalmente feito para microarray (dados contínuos); "voom" converte contagens de RNA-seq para esse mesmo formato, estimando a relação entre média e variância de cada gene.</w:t>
+              <w:t xml:space="preserve">Um caminho estatístico alternativo ao DESeq2. "voom" traduz as contagens brutas de RNA-seq (dados discretos e ruidosos) para uma escala contínua e bem-comportada; "limma" (Linear Models for Microarray data) é o pacote estatístico consagrado que então compara os grupos nessa escala, usando um método (Bayes empírico) que combina informação de todos os genes para dar estimativas mais estáveis com poucas amostras.</w:t>
             </w:r>
           </w:p>
         </w:tc>
@@ -814,7 +814,7 @@
                 <w:sz w:val="19"/>
                 <w:szCs w:val="19"/>
               </w:rPr>
-              <w:t xml:space="preserve">Usado em DOIS papéis secundários: (1) conferência cruzada do resultado do DESeq2; (2) gerar a lista de genes ordenada (rankeada) que alimenta o GSEA na etapa seguinte. NÃO substitui o DESeq2 como método oficial de DEG.</w:t>
+              <w:t xml:space="preserve">Usado em DOIS papéis de apoio: (1) conferência cruzada do resultado do DESeq2; (2) gerar a lista de genes ordenada (rankeada) que alimenta o GSEA na etapa seguinte. NÃO substitui o DESeq2 como método oficial de identificação de DEG.</w:t>
             </w:r>
           </w:p>
         </w:tc>
@@ -833,7 +833,7 @@
           <w:sz w:val="24"/>
           <w:szCs w:val="24"/>
         </w:rPr>
-        <w:t xml:space="preserve">3.2 Análise de vias biológicas — GSEA</w:t>
+        <w:t xml:space="preserve">3.2 Análise de vias biológicas — GSEA (fgsea)</w:t>
       </w:r>
     </w:p>
     <w:tbl>
@@ -967,7 +967,7 @@
                 <w:sz w:val="19"/>
                 <w:szCs w:val="19"/>
               </w:rPr>
-              <w:t xml:space="preserve">GSEA (Gene Set Enrichment Analysis)</w:t>
+              <w:t xml:space="preserve">fgsea</w:t>
             </w:r>
           </w:p>
         </w:tc>
@@ -995,7 +995,7 @@
                 <w:sz w:val="19"/>
                 <w:szCs w:val="19"/>
               </w:rPr>
-              <w:t xml:space="preserve">Método estatístico (Subramanian et al., 2005) que testa se um GRUPO de genes de uma mesma via biológica está deslocado, em conjunto, para um extremo da lista de genes ordenada por expressão — mesmo que nenhum gene individual atinja significância sozinho.</w:t>
+              <w:t xml:space="preserve">Implementação do método GSEA (Gene Set Enrichment Analysis; Subramanian et al., 2005), distribuída pelo Bioconductor e mantida pela comunidade científica internacional — é o pacote de referência usado mundialmente para essa análise. Testa se um GRUPO de genes de uma mesma via biológica está deslocado, em conjunto, para um extremo da lista de genes ordenada por expressão — mesmo que nenhum gene individual atinja significância sozinho.</w:t>
             </w:r>
           </w:p>
         </w:tc>
@@ -1023,7 +1023,7 @@
                 <w:sz w:val="19"/>
                 <w:szCs w:val="19"/>
               </w:rPr>
-              <w:t xml:space="preserve">Implementação própria ("caseira") do algoritmo original, construída porque o ambiente de desenvolvimento não tinha acesso à internet para instalar o pacote oficial. Aplicada tanto em POP (permutação de fenótipo) quanto em SUI (permutação de vias, adaptada ao tamanho amostral pequeno de 3 vs 3).</w:t>
+              <w:t xml:space="preserve">Ferramenta usada para toda a análise de vias biológicas deste projeto, tanto em POP quanto em SUI, sobre a lista de genes ordenada gerada na etapa anterior.</w:t>
             </w:r>
           </w:p>
         </w:tc>
@@ -1109,7 +1109,7 @@
                 <w:sz w:val="19"/>
                 <w:szCs w:val="19"/>
               </w:rPr>
-              <w:t xml:space="preserve">Fonte de TODOS os conjuntos de genes (KEGG e GO) usados neste projeto — permite rodar a análise inteiramente offline, sem depender de servidores externos.</w:t>
+              <w:t xml:space="preserve">Fonte de TODOS os conjuntos de genes (KEGG e GO) fornecidos ao fgsea neste projeto — permite rodar a análise inteiramente offline, sem depender de servidores externos.</w:t>
             </w:r>
           </w:p>
         </w:tc>
@@ -1139,7 +1139,7 @@
                 <w:sz w:val="19"/>
                 <w:szCs w:val="19"/>
               </w:rPr>
-              <w:t xml:space="preserve">fgsea</w:t>
+              <w:t xml:space="preserve">GO.db</w:t>
             </w:r>
           </w:p>
         </w:tc>
@@ -1167,7 +1167,7 @@
                 <w:sz w:val="19"/>
                 <w:szCs w:val="19"/>
               </w:rPr>
-              <w:t xml:space="preserve">Pacote OFICIAL do Bioconductor para GSEA, mantido pela comunidade científica internacional.</w:t>
+              <w:t xml:space="preserve">Banco de dados que traduz um código do Gene Ontology (ex. "GO:0030199") no seu nome legível ("collagen fibril organization").</w:t>
             </w:r>
           </w:p>
         </w:tc>
@@ -1175,92 +1175,6 @@
           <w:tcPr>
             <w:tcW w:type="dxa" w:w="4500"/>
             <w:shd w:fill="FFFFFF" w:val="clear"/>
-            <w:tcMar>
-              <w:top w:type="dxa" w:w="80"/>
-              <w:left w:type="dxa" w:w="100"/>
-              <w:bottom w:type="dxa" w:w="80"/>
-              <w:right w:type="dxa" w:w="100"/>
-            </w:tcMar>
-            <w:vAlign w:val="center"/>
-          </w:tcPr>
-          <w:p>
-            <w:pPr>
-              <w:jc w:val="left"/>
-            </w:pPr>
-            <w:r>
-              <w:rPr>
-                <w:b w:val="false"/>
-                <w:bCs w:val="false"/>
-                <w:color w:val="000000"/>
-                <w:sz w:val="19"/>
-                <w:szCs w:val="19"/>
-              </w:rPr>
-              <w:t xml:space="preserve">Usado para VALIDAR o motor de cálculo da implementação caseira: rodado sobre a MESMA lista de genes ordenada e os MESMOS conjuntos de genes do KEGG/GO já usados acima. A concordância entre os dois métodos confirma que a implementação própria está correta.</w:t>
-            </w:r>
-          </w:p>
-        </w:tc>
-      </w:tr>
-      <w:tr>
-        <w:tc>
-          <w:tcPr>
-            <w:tcW w:type="dxa" w:w="1900"/>
-            <w:shd w:fill="DCE6F1" w:val="clear"/>
-            <w:tcMar>
-              <w:top w:type="dxa" w:w="80"/>
-              <w:left w:type="dxa" w:w="100"/>
-              <w:bottom w:type="dxa" w:w="80"/>
-              <w:right w:type="dxa" w:w="100"/>
-            </w:tcMar>
-            <w:vAlign w:val="center"/>
-          </w:tcPr>
-          <w:p>
-            <w:pPr>
-              <w:jc w:val="left"/>
-            </w:pPr>
-            <w:r>
-              <w:rPr>
-                <w:b w:val="false"/>
-                <w:bCs w:val="false"/>
-                <w:color w:val="000000"/>
-                <w:sz w:val="19"/>
-                <w:szCs w:val="19"/>
-              </w:rPr>
-              <w:t xml:space="preserve">GO.db</w:t>
-            </w:r>
-          </w:p>
-        </w:tc>
-        <w:tc>
-          <w:tcPr>
-            <w:tcW w:type="dxa" w:w="3300"/>
-            <w:shd w:fill="DCE6F1" w:val="clear"/>
-            <w:tcMar>
-              <w:top w:type="dxa" w:w="80"/>
-              <w:left w:type="dxa" w:w="100"/>
-              <w:bottom w:type="dxa" w:w="80"/>
-              <w:right w:type="dxa" w:w="100"/>
-            </w:tcMar>
-            <w:vAlign w:val="center"/>
-          </w:tcPr>
-          <w:p>
-            <w:pPr>
-              <w:jc w:val="left"/>
-            </w:pPr>
-            <w:r>
-              <w:rPr>
-                <w:b w:val="false"/>
-                <w:bCs w:val="false"/>
-                <w:color w:val="000000"/>
-                <w:sz w:val="19"/>
-                <w:szCs w:val="19"/>
-              </w:rPr>
-              <w:t xml:space="preserve">Banco de dados que traduz um código do Gene Ontology (ex. "GO:0030199") no seu nome legível ("collagen fibril organization").</w:t>
-            </w:r>
-          </w:p>
-        </w:tc>
-        <w:tc>
-          <w:tcPr>
-            <w:tcW w:type="dxa" w:w="4500"/>
-            <w:shd w:fill="DCE6F1" w:val="clear"/>
             <w:tcMar>
               <w:top w:type="dxa" w:w="80"/>
               <w:left w:type="dxa" w:w="100"/>
@@ -1300,7 +1214,7 @@
           <w:sz w:val="24"/>
           <w:szCs w:val="24"/>
         </w:rPr>
-        <w:t xml:space="preserve">3.3 Camada complementar de validação</w:t>
+        <w:t xml:space="preserve">3.3 Camada complementar de análise</w:t>
       </w:r>
     </w:p>
     <w:tbl>
@@ -1490,7 +1404,7 @@
                 <w:sz w:val="19"/>
                 <w:szCs w:val="19"/>
               </w:rPr>
-              <w:t xml:space="preserve">Conjunto de ~218 vias testado tanto no GSEA caseiro quanto no fgsea oficial, em POP e SUI.</w:t>
+              <w:t xml:space="preserve">Conjunto de ~218 vias testado via fgsea em POP e SUI.</w:t>
             </w:r>
           </w:p>
         </w:tc>
@@ -1576,7 +1490,7 @@
                 <w:sz w:val="19"/>
                 <w:szCs w:val="19"/>
               </w:rPr>
-              <w:t xml:space="preserve">Testado via fgsea diretamente (não pelo código caseiro, que seria lento demais para milhares de termos), usando as mesmas listas de genes ordenadas de POP e SUI.</w:t>
+              <w:t xml:space="preserve">Testado via fgsea, usando as mesmas listas de genes ordenadas de POP e SUI.</w:t>
             </w:r>
           </w:p>
         </w:tc>
@@ -1750,7 +1664,7 @@
           <w:sz w:val="24"/>
           <w:szCs w:val="24"/>
         </w:rPr>
-        <w:t xml:space="preserve">4.2 Vias KEGG (GSEA)</w:t>
+        <w:t xml:space="preserve">4.2 Vias KEGG (GSEA via fgsea)</w:t>
       </w:r>
     </w:p>
     <w:tbl>
@@ -1998,7 +1912,7 @@
                 <w:sz w:val="19"/>
                 <w:szCs w:val="19"/>
               </w:rPr>
-              <w:t xml:space="preserve">117</w:t>
+              <w:t xml:space="preserve">90</w:t>
             </w:r>
           </w:p>
         </w:tc>
@@ -2026,7 +1940,7 @@
                 <w:sz w:val="19"/>
                 <w:szCs w:val="19"/>
               </w:rPr>
-              <w:t xml:space="preserve">50</w:t>
+              <w:t xml:space="preserve">20</w:t>
             </w:r>
           </w:p>
         </w:tc>
@@ -2084,7 +1998,7 @@
                 <w:sz w:val="19"/>
                 <w:szCs w:val="19"/>
               </w:rPr>
-              <w:t xml:space="preserve">97</w:t>
+              <w:t xml:space="preserve">49</w:t>
             </w:r>
           </w:p>
         </w:tc>
@@ -2112,7 +2026,7 @@
                 <w:sz w:val="19"/>
                 <w:szCs w:val="19"/>
               </w:rPr>
-              <w:t xml:space="preserve">0*</w:t>
+              <w:t xml:space="preserve">1*</w:t>
             </w:r>
           </w:p>
         </w:tc>
@@ -2170,7 +2084,7 @@
                 <w:sz w:val="19"/>
                 <w:szCs w:val="19"/>
               </w:rPr>
-              <w:t xml:space="preserve">21–22 vias em comum</w:t>
+              <w:t xml:space="preserve">6 vias em comum</w:t>
             </w:r>
           </w:p>
         </w:tc>
@@ -2216,7 +2130,7 @@
           <w:sz w:val="21"/>
           <w:szCs w:val="21"/>
         </w:rPr>
-        <w:t xml:space="preserve">*Nenhuma via atinge FDR&lt;0,05 em SUI devido ao desenho 3 vs 3 (poder estatístico limitado) — esperado e já documentado, não é uma falha da análise.</w:t>
+        <w:t xml:space="preserve">*Apenas uma via atinge FDR&lt;0,05 em SUI devido ao desenho 3 vs 3 (poder estatístico limitado) — esperado e já documentado, não é uma falha da análise.</w:t>
       </w:r>
     </w:p>
     <w:p>
@@ -2232,7 +2146,7 @@
           <w:sz w:val="24"/>
           <w:szCs w:val="24"/>
         </w:rPr>
-        <w:t xml:space="preserve">4.3 Validação do motor de cálculo (fgsea oficial)</w:t>
+        <w:t xml:space="preserve">4.3 Direção das vias compartilhadas</w:t>
       </w:r>
     </w:p>
     <w:p>
@@ -2244,7 +2158,2016 @@
           <w:sz w:val="21"/>
           <w:szCs w:val="21"/>
         </w:rPr>
-        <w:t xml:space="preserve">Ao rodar o pacote oficial fgsea sobre os MESMOS dados e conjuntos de genes usados na implementação caseira, os resultados apresentaram forte concordância de direção (a maioria das vias comparáveis concorda no sentido do efeito — aumentado ou diminuído), confirmando que o motor de cálculo do GSEA construído para este projeto está correto.</w:t>
+        <w:t xml:space="preserve">Das 6 vias que atingem significância (FDR&lt;0,25) simultaneamente em POP e em SUI, TODAS (100%) apresentam a mesma direção de efeito nas duas doenças — ou seja, nenhuma vai "para cima" numa doença e "para baixo" na outra:</w:t>
+      </w:r>
+    </w:p>
+    <w:tbl>
+      <w:tblPr>
+        <w:tblW w:type="dxa" w:w="10900"/>
+        <w:tblBorders>
+          <w:top w:val="single" w:color="auto" w:sz="4"/>
+          <w:left w:val="single" w:color="auto" w:sz="4"/>
+          <w:bottom w:val="single" w:color="auto" w:sz="4"/>
+          <w:right w:val="single" w:color="auto" w:sz="4"/>
+          <w:insideH w:val="single" w:color="auto" w:sz="4"/>
+          <w:insideV w:val="single" w:color="auto" w:sz="4"/>
+        </w:tblBorders>
+      </w:tblPr>
+      <w:tblGrid>
+        <w:gridCol w:w="2400"/>
+        <w:gridCol w:w="4700"/>
+        <w:gridCol w:w="1900"/>
+        <w:gridCol w:w="1900"/>
+      </w:tblGrid>
+      <w:tr>
+        <w:trPr>
+          <w:tblHeader/>
+        </w:trPr>
+        <w:tc>
+          <w:tcPr>
+            <w:tcW w:type="dxa" w:w="2400"/>
+            <w:shd w:fill="1F3864" w:val="clear"/>
+            <w:tcMar>
+              <w:top w:type="dxa" w:w="80"/>
+              <w:left w:type="dxa" w:w="100"/>
+              <w:bottom w:type="dxa" w:w="80"/>
+              <w:right w:type="dxa" w:w="100"/>
+            </w:tcMar>
+            <w:vAlign w:val="center"/>
+          </w:tcPr>
+          <w:p>
+            <w:pPr>
+              <w:jc w:val="left"/>
+            </w:pPr>
+            <w:r>
+              <w:rPr>
+                <w:b/>
+                <w:bCs/>
+                <w:color w:val="FFFFFF"/>
+                <w:sz w:val="20"/>
+                <w:szCs w:val="20"/>
+              </w:rPr>
+              <w:t xml:space="preserve">Via KEGG</w:t>
+            </w:r>
+          </w:p>
+        </w:tc>
+        <w:tc>
+          <w:tcPr>
+            <w:tcW w:type="dxa" w:w="4700"/>
+            <w:shd w:fill="1F3864" w:val="clear"/>
+            <w:tcMar>
+              <w:top w:type="dxa" w:w="80"/>
+              <w:left w:type="dxa" w:w="100"/>
+              <w:bottom w:type="dxa" w:w="80"/>
+              <w:right w:type="dxa" w:w="100"/>
+            </w:tcMar>
+            <w:vAlign w:val="center"/>
+          </w:tcPr>
+          <w:p>
+            <w:pPr>
+              <w:jc w:val="left"/>
+            </w:pPr>
+            <w:r>
+              <w:rPr>
+                <w:b/>
+                <w:bCs/>
+                <w:color w:val="FFFFFF"/>
+                <w:sz w:val="20"/>
+                <w:szCs w:val="20"/>
+              </w:rPr>
+              <w:t xml:space="preserve">Direção</w:t>
+            </w:r>
+          </w:p>
+        </w:tc>
+        <w:tc>
+          <w:tcPr>
+            <w:tcW w:type="dxa" w:w="1900"/>
+            <w:shd w:fill="1F3864" w:val="clear"/>
+            <w:tcMar>
+              <w:top w:type="dxa" w:w="80"/>
+              <w:left w:type="dxa" w:w="100"/>
+              <w:bottom w:type="dxa" w:w="80"/>
+              <w:right w:type="dxa" w:w="100"/>
+            </w:tcMar>
+            <w:vAlign w:val="center"/>
+          </w:tcPr>
+          <w:p>
+            <w:pPr>
+              <w:jc w:val="left"/>
+            </w:pPr>
+            <w:r>
+              <w:rPr>
+                <w:b/>
+                <w:bCs/>
+                <w:color w:val="FFFFFF"/>
+                <w:sz w:val="20"/>
+                <w:szCs w:val="20"/>
+              </w:rPr>
+              <w:t xml:space="preserve">FDR POP</w:t>
+            </w:r>
+          </w:p>
+        </w:tc>
+        <w:tc>
+          <w:tcPr>
+            <w:tcW w:type="dxa" w:w="1900"/>
+            <w:shd w:fill="1F3864" w:val="clear"/>
+            <w:tcMar>
+              <w:top w:type="dxa" w:w="80"/>
+              <w:left w:type="dxa" w:w="100"/>
+              <w:bottom w:type="dxa" w:w="80"/>
+              <w:right w:type="dxa" w:w="100"/>
+            </w:tcMar>
+            <w:vAlign w:val="center"/>
+          </w:tcPr>
+          <w:p>
+            <w:pPr>
+              <w:jc w:val="left"/>
+            </w:pPr>
+            <w:r>
+              <w:rPr>
+                <w:b/>
+                <w:bCs/>
+                <w:color w:val="FFFFFF"/>
+                <w:sz w:val="20"/>
+                <w:szCs w:val="20"/>
+              </w:rPr>
+              <w:t xml:space="preserve">FDR SUI</w:t>
+            </w:r>
+          </w:p>
+        </w:tc>
+      </w:tr>
+      <w:tr>
+        <w:tc>
+          <w:tcPr>
+            <w:tcW w:type="dxa" w:w="2400"/>
+            <w:shd w:fill="FFFFFF" w:val="clear"/>
+            <w:tcMar>
+              <w:top w:type="dxa" w:w="80"/>
+              <w:left w:type="dxa" w:w="100"/>
+              <w:bottom w:type="dxa" w:w="80"/>
+              <w:right w:type="dxa" w:w="100"/>
+            </w:tcMar>
+            <w:vAlign w:val="center"/>
+          </w:tcPr>
+          <w:p>
+            <w:pPr>
+              <w:jc w:val="left"/>
+            </w:pPr>
+            <w:r>
+              <w:rPr>
+                <w:b w:val="false"/>
+                <w:bCs w:val="false"/>
+                <w:color w:val="000000"/>
+                <w:sz w:val="19"/>
+                <w:szCs w:val="19"/>
+              </w:rPr>
+              <w:t xml:space="preserve">Ribosome</w:t>
+            </w:r>
+          </w:p>
+        </w:tc>
+        <w:tc>
+          <w:tcPr>
+            <w:tcW w:type="dxa" w:w="4700"/>
+            <w:shd w:fill="FFFFFF" w:val="clear"/>
+            <w:tcMar>
+              <w:top w:type="dxa" w:w="80"/>
+              <w:left w:type="dxa" w:w="100"/>
+              <w:bottom w:type="dxa" w:w="80"/>
+              <w:right w:type="dxa" w:w="100"/>
+            </w:tcMar>
+            <w:vAlign w:val="center"/>
+          </w:tcPr>
+          <w:p>
+            <w:pPr>
+              <w:jc w:val="left"/>
+            </w:pPr>
+            <w:r>
+              <w:rPr>
+                <w:b w:val="false"/>
+                <w:bCs w:val="false"/>
+                <w:color w:val="000000"/>
+                <w:sz w:val="19"/>
+                <w:szCs w:val="19"/>
+              </w:rPr>
+              <w:t xml:space="preserve">mesma direção (para cima)</w:t>
+            </w:r>
+          </w:p>
+        </w:tc>
+        <w:tc>
+          <w:tcPr>
+            <w:tcW w:type="dxa" w:w="1900"/>
+            <w:shd w:fill="FFFFFF" w:val="clear"/>
+            <w:tcMar>
+              <w:top w:type="dxa" w:w="80"/>
+              <w:left w:type="dxa" w:w="100"/>
+              <w:bottom w:type="dxa" w:w="80"/>
+              <w:right w:type="dxa" w:w="100"/>
+            </w:tcMar>
+            <w:vAlign w:val="center"/>
+          </w:tcPr>
+          <w:p>
+            <w:pPr>
+              <w:jc w:val="left"/>
+            </w:pPr>
+            <w:r>
+              <w:rPr>
+                <w:b w:val="false"/>
+                <w:bCs w:val="false"/>
+                <w:color w:val="000000"/>
+                <w:sz w:val="19"/>
+                <w:szCs w:val="19"/>
+              </w:rPr>
+              <w:t xml:space="preserve">7,5×10⁻⁵</w:t>
+            </w:r>
+          </w:p>
+        </w:tc>
+        <w:tc>
+          <w:tcPr>
+            <w:tcW w:type="dxa" w:w="1900"/>
+            <w:shd w:fill="FFFFFF" w:val="clear"/>
+            <w:tcMar>
+              <w:top w:type="dxa" w:w="80"/>
+              <w:left w:type="dxa" w:w="100"/>
+              <w:bottom w:type="dxa" w:w="80"/>
+              <w:right w:type="dxa" w:w="100"/>
+            </w:tcMar>
+            <w:vAlign w:val="center"/>
+          </w:tcPr>
+          <w:p>
+            <w:pPr>
+              <w:jc w:val="left"/>
+            </w:pPr>
+            <w:r>
+              <w:rPr>
+                <w:b w:val="false"/>
+                <w:bCs w:val="false"/>
+                <w:color w:val="000000"/>
+                <w:sz w:val="19"/>
+                <w:szCs w:val="19"/>
+              </w:rPr>
+              <w:t xml:space="preserve">1,6×10⁻¹³</w:t>
+            </w:r>
+          </w:p>
+        </w:tc>
+      </w:tr>
+      <w:tr>
+        <w:tc>
+          <w:tcPr>
+            <w:tcW w:type="dxa" w:w="2400"/>
+            <w:shd w:fill="DCE6F1" w:val="clear"/>
+            <w:tcMar>
+              <w:top w:type="dxa" w:w="80"/>
+              <w:left w:type="dxa" w:w="100"/>
+              <w:bottom w:type="dxa" w:w="80"/>
+              <w:right w:type="dxa" w:w="100"/>
+            </w:tcMar>
+            <w:vAlign w:val="center"/>
+          </w:tcPr>
+          <w:p>
+            <w:pPr>
+              <w:jc w:val="left"/>
+            </w:pPr>
+            <w:r>
+              <w:rPr>
+                <w:b w:val="false"/>
+                <w:bCs w:val="false"/>
+                <w:color w:val="000000"/>
+                <w:sz w:val="19"/>
+                <w:szCs w:val="19"/>
+              </w:rPr>
+              <w:t xml:space="preserve">Protein processing in endoplasmic reticulum</w:t>
+            </w:r>
+          </w:p>
+        </w:tc>
+        <w:tc>
+          <w:tcPr>
+            <w:tcW w:type="dxa" w:w="4700"/>
+            <w:shd w:fill="DCE6F1" w:val="clear"/>
+            <w:tcMar>
+              <w:top w:type="dxa" w:w="80"/>
+              <w:left w:type="dxa" w:w="100"/>
+              <w:bottom w:type="dxa" w:w="80"/>
+              <w:right w:type="dxa" w:w="100"/>
+            </w:tcMar>
+            <w:vAlign w:val="center"/>
+          </w:tcPr>
+          <w:p>
+            <w:pPr>
+              <w:jc w:val="left"/>
+            </w:pPr>
+            <w:r>
+              <w:rPr>
+                <w:b w:val="false"/>
+                <w:bCs w:val="false"/>
+                <w:color w:val="000000"/>
+                <w:sz w:val="19"/>
+                <w:szCs w:val="19"/>
+              </w:rPr>
+              <w:t xml:space="preserve">mesma direção (para cima)</w:t>
+            </w:r>
+          </w:p>
+        </w:tc>
+        <w:tc>
+          <w:tcPr>
+            <w:tcW w:type="dxa" w:w="1900"/>
+            <w:shd w:fill="DCE6F1" w:val="clear"/>
+            <w:tcMar>
+              <w:top w:type="dxa" w:w="80"/>
+              <w:left w:type="dxa" w:w="100"/>
+              <w:bottom w:type="dxa" w:w="80"/>
+              <w:right w:type="dxa" w:w="100"/>
+            </w:tcMar>
+            <w:vAlign w:val="center"/>
+          </w:tcPr>
+          <w:p>
+            <w:pPr>
+              <w:jc w:val="left"/>
+            </w:pPr>
+            <w:r>
+              <w:rPr>
+                <w:b w:val="false"/>
+                <w:bCs w:val="false"/>
+                <w:color w:val="000000"/>
+                <w:sz w:val="19"/>
+                <w:szCs w:val="19"/>
+              </w:rPr>
+              <w:t xml:space="preserve">3,5×10⁻⁴</w:t>
+            </w:r>
+          </w:p>
+        </w:tc>
+        <w:tc>
+          <w:tcPr>
+            <w:tcW w:type="dxa" w:w="1900"/>
+            <w:shd w:fill="DCE6F1" w:val="clear"/>
+            <w:tcMar>
+              <w:top w:type="dxa" w:w="80"/>
+              <w:left w:type="dxa" w:w="100"/>
+              <w:bottom w:type="dxa" w:w="80"/>
+              <w:right w:type="dxa" w:w="100"/>
+            </w:tcMar>
+            <w:vAlign w:val="center"/>
+          </w:tcPr>
+          <w:p>
+            <w:pPr>
+              <w:jc w:val="left"/>
+            </w:pPr>
+            <w:r>
+              <w:rPr>
+                <w:b w:val="false"/>
+                <w:bCs w:val="false"/>
+                <w:color w:val="000000"/>
+                <w:sz w:val="19"/>
+                <w:szCs w:val="19"/>
+              </w:rPr>
+              <w:t xml:space="preserve">0,144</w:t>
+            </w:r>
+          </w:p>
+        </w:tc>
+      </w:tr>
+      <w:tr>
+        <w:tc>
+          <w:tcPr>
+            <w:tcW w:type="dxa" w:w="2400"/>
+            <w:shd w:fill="FFFFFF" w:val="clear"/>
+            <w:tcMar>
+              <w:top w:type="dxa" w:w="80"/>
+              <w:left w:type="dxa" w:w="100"/>
+              <w:bottom w:type="dxa" w:w="80"/>
+              <w:right w:type="dxa" w:w="100"/>
+            </w:tcMar>
+            <w:vAlign w:val="center"/>
+          </w:tcPr>
+          <w:p>
+            <w:pPr>
+              <w:jc w:val="left"/>
+            </w:pPr>
+            <w:r>
+              <w:rPr>
+                <w:b w:val="false"/>
+                <w:bCs w:val="false"/>
+                <w:color w:val="000000"/>
+                <w:sz w:val="19"/>
+                <w:szCs w:val="19"/>
+              </w:rPr>
+              <w:t xml:space="preserve">Glutathione metabolism</w:t>
+            </w:r>
+          </w:p>
+        </w:tc>
+        <w:tc>
+          <w:tcPr>
+            <w:tcW w:type="dxa" w:w="4700"/>
+            <w:shd w:fill="FFFFFF" w:val="clear"/>
+            <w:tcMar>
+              <w:top w:type="dxa" w:w="80"/>
+              <w:left w:type="dxa" w:w="100"/>
+              <w:bottom w:type="dxa" w:w="80"/>
+              <w:right w:type="dxa" w:w="100"/>
+            </w:tcMar>
+            <w:vAlign w:val="center"/>
+          </w:tcPr>
+          <w:p>
+            <w:pPr>
+              <w:jc w:val="left"/>
+            </w:pPr>
+            <w:r>
+              <w:rPr>
+                <w:b w:val="false"/>
+                <w:bCs w:val="false"/>
+                <w:color w:val="000000"/>
+                <w:sz w:val="19"/>
+                <w:szCs w:val="19"/>
+              </w:rPr>
+              <w:t xml:space="preserve">mesma direção (para cima)</w:t>
+            </w:r>
+          </w:p>
+        </w:tc>
+        <w:tc>
+          <w:tcPr>
+            <w:tcW w:type="dxa" w:w="1900"/>
+            <w:shd w:fill="FFFFFF" w:val="clear"/>
+            <w:tcMar>
+              <w:top w:type="dxa" w:w="80"/>
+              <w:left w:type="dxa" w:w="100"/>
+              <w:bottom w:type="dxa" w:w="80"/>
+              <w:right w:type="dxa" w:w="100"/>
+            </w:tcMar>
+            <w:vAlign w:val="center"/>
+          </w:tcPr>
+          <w:p>
+            <w:pPr>
+              <w:jc w:val="left"/>
+            </w:pPr>
+            <w:r>
+              <w:rPr>
+                <w:b w:val="false"/>
+                <w:bCs w:val="false"/>
+                <w:color w:val="000000"/>
+                <w:sz w:val="19"/>
+                <w:szCs w:val="19"/>
+              </w:rPr>
+              <w:t xml:space="preserve">4,2×10⁻⁴</w:t>
+            </w:r>
+          </w:p>
+        </w:tc>
+        <w:tc>
+          <w:tcPr>
+            <w:tcW w:type="dxa" w:w="1900"/>
+            <w:shd w:fill="FFFFFF" w:val="clear"/>
+            <w:tcMar>
+              <w:top w:type="dxa" w:w="80"/>
+              <w:left w:type="dxa" w:w="100"/>
+              <w:bottom w:type="dxa" w:w="80"/>
+              <w:right w:type="dxa" w:w="100"/>
+            </w:tcMar>
+            <w:vAlign w:val="center"/>
+          </w:tcPr>
+          <w:p>
+            <w:pPr>
+              <w:jc w:val="left"/>
+            </w:pPr>
+            <w:r>
+              <w:rPr>
+                <w:b w:val="false"/>
+                <w:bCs w:val="false"/>
+                <w:color w:val="000000"/>
+                <w:sz w:val="19"/>
+                <w:szCs w:val="19"/>
+              </w:rPr>
+              <w:t xml:space="preserve">0,144</w:t>
+            </w:r>
+          </w:p>
+        </w:tc>
+      </w:tr>
+      <w:tr>
+        <w:tc>
+          <w:tcPr>
+            <w:tcW w:type="dxa" w:w="2400"/>
+            <w:shd w:fill="DCE6F1" w:val="clear"/>
+            <w:tcMar>
+              <w:top w:type="dxa" w:w="80"/>
+              <w:left w:type="dxa" w:w="100"/>
+              <w:bottom w:type="dxa" w:w="80"/>
+              <w:right w:type="dxa" w:w="100"/>
+            </w:tcMar>
+            <w:vAlign w:val="center"/>
+          </w:tcPr>
+          <w:p>
+            <w:pPr>
+              <w:jc w:val="left"/>
+            </w:pPr>
+            <w:r>
+              <w:rPr>
+                <w:b w:val="false"/>
+                <w:bCs w:val="false"/>
+                <w:color w:val="000000"/>
+                <w:sz w:val="19"/>
+                <w:szCs w:val="19"/>
+              </w:rPr>
+              <w:t xml:space="preserve">Glycolysis / Gluconeogenesis</w:t>
+            </w:r>
+          </w:p>
+        </w:tc>
+        <w:tc>
+          <w:tcPr>
+            <w:tcW w:type="dxa" w:w="4700"/>
+            <w:shd w:fill="DCE6F1" w:val="clear"/>
+            <w:tcMar>
+              <w:top w:type="dxa" w:w="80"/>
+              <w:left w:type="dxa" w:w="100"/>
+              <w:bottom w:type="dxa" w:w="80"/>
+              <w:right w:type="dxa" w:w="100"/>
+            </w:tcMar>
+            <w:vAlign w:val="center"/>
+          </w:tcPr>
+          <w:p>
+            <w:pPr>
+              <w:jc w:val="left"/>
+            </w:pPr>
+            <w:r>
+              <w:rPr>
+                <w:b w:val="false"/>
+                <w:bCs w:val="false"/>
+                <w:color w:val="000000"/>
+                <w:sz w:val="19"/>
+                <w:szCs w:val="19"/>
+              </w:rPr>
+              <w:t xml:space="preserve">mesma direção (para cima)</w:t>
+            </w:r>
+          </w:p>
+        </w:tc>
+        <w:tc>
+          <w:tcPr>
+            <w:tcW w:type="dxa" w:w="1900"/>
+            <w:shd w:fill="DCE6F1" w:val="clear"/>
+            <w:tcMar>
+              <w:top w:type="dxa" w:w="80"/>
+              <w:left w:type="dxa" w:w="100"/>
+              <w:bottom w:type="dxa" w:w="80"/>
+              <w:right w:type="dxa" w:w="100"/>
+            </w:tcMar>
+            <w:vAlign w:val="center"/>
+          </w:tcPr>
+          <w:p>
+            <w:pPr>
+              <w:jc w:val="left"/>
+            </w:pPr>
+            <w:r>
+              <w:rPr>
+                <w:b w:val="false"/>
+                <w:bCs w:val="false"/>
+                <w:color w:val="000000"/>
+                <w:sz w:val="19"/>
+                <w:szCs w:val="19"/>
+              </w:rPr>
+              <w:t xml:space="preserve">0,014</w:t>
+            </w:r>
+          </w:p>
+        </w:tc>
+        <w:tc>
+          <w:tcPr>
+            <w:tcW w:type="dxa" w:w="1900"/>
+            <w:shd w:fill="DCE6F1" w:val="clear"/>
+            <w:tcMar>
+              <w:top w:type="dxa" w:w="80"/>
+              <w:left w:type="dxa" w:w="100"/>
+              <w:bottom w:type="dxa" w:w="80"/>
+              <w:right w:type="dxa" w:w="100"/>
+            </w:tcMar>
+            <w:vAlign w:val="center"/>
+          </w:tcPr>
+          <w:p>
+            <w:pPr>
+              <w:jc w:val="left"/>
+            </w:pPr>
+            <w:r>
+              <w:rPr>
+                <w:b w:val="false"/>
+                <w:bCs w:val="false"/>
+                <w:color w:val="000000"/>
+                <w:sz w:val="19"/>
+                <w:szCs w:val="19"/>
+              </w:rPr>
+              <w:t xml:space="preserve">0,245</w:t>
+            </w:r>
+          </w:p>
+        </w:tc>
+      </w:tr>
+      <w:tr>
+        <w:tc>
+          <w:tcPr>
+            <w:tcW w:type="dxa" w:w="2400"/>
+            <w:shd w:fill="FFFFFF" w:val="clear"/>
+            <w:tcMar>
+              <w:top w:type="dxa" w:w="80"/>
+              <w:left w:type="dxa" w:w="100"/>
+              <w:bottom w:type="dxa" w:w="80"/>
+              <w:right w:type="dxa" w:w="100"/>
+            </w:tcMar>
+            <w:vAlign w:val="center"/>
+          </w:tcPr>
+          <w:p>
+            <w:pPr>
+              <w:jc w:val="left"/>
+            </w:pPr>
+            <w:r>
+              <w:rPr>
+                <w:b w:val="false"/>
+                <w:bCs w:val="false"/>
+                <w:color w:val="000000"/>
+                <w:sz w:val="19"/>
+                <w:szCs w:val="19"/>
+              </w:rPr>
+              <w:t xml:space="preserve">Metabolism of xenobiotics by cytochrome P450</w:t>
+            </w:r>
+          </w:p>
+        </w:tc>
+        <w:tc>
+          <w:tcPr>
+            <w:tcW w:type="dxa" w:w="4700"/>
+            <w:shd w:fill="FFFFFF" w:val="clear"/>
+            <w:tcMar>
+              <w:top w:type="dxa" w:w="80"/>
+              <w:left w:type="dxa" w:w="100"/>
+              <w:bottom w:type="dxa" w:w="80"/>
+              <w:right w:type="dxa" w:w="100"/>
+            </w:tcMar>
+            <w:vAlign w:val="center"/>
+          </w:tcPr>
+          <w:p>
+            <w:pPr>
+              <w:jc w:val="left"/>
+            </w:pPr>
+            <w:r>
+              <w:rPr>
+                <w:b w:val="false"/>
+                <w:bCs w:val="false"/>
+                <w:color w:val="000000"/>
+                <w:sz w:val="19"/>
+                <w:szCs w:val="19"/>
+              </w:rPr>
+              <w:t xml:space="preserve">mesma direção (para cima)</w:t>
+            </w:r>
+          </w:p>
+        </w:tc>
+        <w:tc>
+          <w:tcPr>
+            <w:tcW w:type="dxa" w:w="1900"/>
+            <w:shd w:fill="FFFFFF" w:val="clear"/>
+            <w:tcMar>
+              <w:top w:type="dxa" w:w="80"/>
+              <w:left w:type="dxa" w:w="100"/>
+              <w:bottom w:type="dxa" w:w="80"/>
+              <w:right w:type="dxa" w:w="100"/>
+            </w:tcMar>
+            <w:vAlign w:val="center"/>
+          </w:tcPr>
+          <w:p>
+            <w:pPr>
+              <w:jc w:val="left"/>
+            </w:pPr>
+            <w:r>
+              <w:rPr>
+                <w:b w:val="false"/>
+                <w:bCs w:val="false"/>
+                <w:color w:val="000000"/>
+                <w:sz w:val="19"/>
+                <w:szCs w:val="19"/>
+              </w:rPr>
+              <w:t xml:space="preserve">0,015</w:t>
+            </w:r>
+          </w:p>
+        </w:tc>
+        <w:tc>
+          <w:tcPr>
+            <w:tcW w:type="dxa" w:w="1900"/>
+            <w:shd w:fill="FFFFFF" w:val="clear"/>
+            <w:tcMar>
+              <w:top w:type="dxa" w:w="80"/>
+              <w:left w:type="dxa" w:w="100"/>
+              <w:bottom w:type="dxa" w:w="80"/>
+              <w:right w:type="dxa" w:w="100"/>
+            </w:tcMar>
+            <w:vAlign w:val="center"/>
+          </w:tcPr>
+          <w:p>
+            <w:pPr>
+              <w:jc w:val="left"/>
+            </w:pPr>
+            <w:r>
+              <w:rPr>
+                <w:b w:val="false"/>
+                <w:bCs w:val="false"/>
+                <w:color w:val="000000"/>
+                <w:sz w:val="19"/>
+                <w:szCs w:val="19"/>
+              </w:rPr>
+              <w:t xml:space="preserve">0,157</w:t>
+            </w:r>
+          </w:p>
+        </w:tc>
+      </w:tr>
+      <w:tr>
+        <w:tc>
+          <w:tcPr>
+            <w:tcW w:type="dxa" w:w="2400"/>
+            <w:shd w:fill="DCE6F1" w:val="clear"/>
+            <w:tcMar>
+              <w:top w:type="dxa" w:w="80"/>
+              <w:left w:type="dxa" w:w="100"/>
+              <w:bottom w:type="dxa" w:w="80"/>
+              <w:right w:type="dxa" w:w="100"/>
+            </w:tcMar>
+            <w:vAlign w:val="center"/>
+          </w:tcPr>
+          <w:p>
+            <w:pPr>
+              <w:jc w:val="left"/>
+            </w:pPr>
+            <w:r>
+              <w:rPr>
+                <w:b w:val="false"/>
+                <w:bCs w:val="false"/>
+                <w:color w:val="000000"/>
+                <w:sz w:val="19"/>
+                <w:szCs w:val="19"/>
+              </w:rPr>
+              <w:t xml:space="preserve">Focal adhesion</w:t>
+            </w:r>
+          </w:p>
+        </w:tc>
+        <w:tc>
+          <w:tcPr>
+            <w:tcW w:type="dxa" w:w="4700"/>
+            <w:shd w:fill="DCE6F1" w:val="clear"/>
+            <w:tcMar>
+              <w:top w:type="dxa" w:w="80"/>
+              <w:left w:type="dxa" w:w="100"/>
+              <w:bottom w:type="dxa" w:w="80"/>
+              <w:right w:type="dxa" w:w="100"/>
+            </w:tcMar>
+            <w:vAlign w:val="center"/>
+          </w:tcPr>
+          <w:p>
+            <w:pPr>
+              <w:jc w:val="left"/>
+            </w:pPr>
+            <w:r>
+              <w:rPr>
+                <w:b w:val="false"/>
+                <w:bCs w:val="false"/>
+                <w:color w:val="000000"/>
+                <w:sz w:val="19"/>
+                <w:szCs w:val="19"/>
+              </w:rPr>
+              <w:t xml:space="preserve">mesma direção (para baixo)</w:t>
+            </w:r>
+          </w:p>
+        </w:tc>
+        <w:tc>
+          <w:tcPr>
+            <w:tcW w:type="dxa" w:w="1900"/>
+            <w:shd w:fill="DCE6F1" w:val="clear"/>
+            <w:tcMar>
+              <w:top w:type="dxa" w:w="80"/>
+              <w:left w:type="dxa" w:w="100"/>
+              <w:bottom w:type="dxa" w:w="80"/>
+              <w:right w:type="dxa" w:w="100"/>
+            </w:tcMar>
+            <w:vAlign w:val="center"/>
+          </w:tcPr>
+          <w:p>
+            <w:pPr>
+              <w:jc w:val="left"/>
+            </w:pPr>
+            <w:r>
+              <w:rPr>
+                <w:b w:val="false"/>
+                <w:bCs w:val="false"/>
+                <w:color w:val="000000"/>
+                <w:sz w:val="19"/>
+                <w:szCs w:val="19"/>
+              </w:rPr>
+              <w:t xml:space="preserve">0,070</w:t>
+            </w:r>
+          </w:p>
+        </w:tc>
+        <w:tc>
+          <w:tcPr>
+            <w:tcW w:type="dxa" w:w="1900"/>
+            <w:shd w:fill="DCE6F1" w:val="clear"/>
+            <w:tcMar>
+              <w:top w:type="dxa" w:w="80"/>
+              <w:left w:type="dxa" w:w="100"/>
+              <w:bottom w:type="dxa" w:w="80"/>
+              <w:right w:type="dxa" w:w="100"/>
+            </w:tcMar>
+            <w:vAlign w:val="center"/>
+          </w:tcPr>
+          <w:p>
+            <w:pPr>
+              <w:jc w:val="left"/>
+            </w:pPr>
+            <w:r>
+              <w:rPr>
+                <w:b w:val="false"/>
+                <w:bCs w:val="false"/>
+                <w:color w:val="000000"/>
+                <w:sz w:val="19"/>
+                <w:szCs w:val="19"/>
+              </w:rPr>
+              <w:t xml:space="preserve">0,144</w:t>
+            </w:r>
+          </w:p>
+        </w:tc>
+      </w:tr>
+    </w:tbl>
+    <w:p>
+      <w:pPr>
+        <w:spacing w:after="160" w:line="300"/>
+      </w:pPr>
+      <w:r>
+        <w:rPr>
+          <w:sz w:val="21"/>
+          <w:szCs w:val="21"/>
+        </w:rPr>
+        <w:t xml:space="preserve">Adicionalmente, ao verificar diretamente a direção de mais 9 vias de interesse biológico para a hipótese de tecido conjuntivo/ECM (que não atingem FDR&lt;0,25 em ambas simultaneamente, mas têm direção bem definida em cada uma via fgsea — Focal adhesion já consta na tabela acima), TODAS as 9 também mostram a mesma direção em POP e SUI — incluindo ECM-receptor interaction e Regulation of actin cytoskeleton, ambas reguladas para BAIXO nas duas condições:</w:t>
+      </w:r>
+    </w:p>
+    <w:tbl>
+      <w:tblPr>
+        <w:tblW w:type="dxa" w:w="10900"/>
+        <w:tblBorders>
+          <w:top w:val="single" w:color="auto" w:sz="4"/>
+          <w:left w:val="single" w:color="auto" w:sz="4"/>
+          <w:bottom w:val="single" w:color="auto" w:sz="4"/>
+          <w:right w:val="single" w:color="auto" w:sz="4"/>
+          <w:insideH w:val="single" w:color="auto" w:sz="4"/>
+          <w:insideV w:val="single" w:color="auto" w:sz="4"/>
+        </w:tblBorders>
+      </w:tblPr>
+      <w:tblGrid>
+        <w:gridCol w:w="3600"/>
+        <w:gridCol w:w="2500"/>
+        <w:gridCol w:w="2500"/>
+        <w:gridCol w:w="2300"/>
+      </w:tblGrid>
+      <w:tr>
+        <w:trPr>
+          <w:tblHeader/>
+        </w:trPr>
+        <w:tc>
+          <w:tcPr>
+            <w:tcW w:type="dxa" w:w="3600"/>
+            <w:shd w:fill="1F3864" w:val="clear"/>
+            <w:tcMar>
+              <w:top w:type="dxa" w:w="80"/>
+              <w:left w:type="dxa" w:w="100"/>
+              <w:bottom w:type="dxa" w:w="80"/>
+              <w:right w:type="dxa" w:w="100"/>
+            </w:tcMar>
+            <w:vAlign w:val="center"/>
+          </w:tcPr>
+          <w:p>
+            <w:pPr>
+              <w:jc w:val="left"/>
+            </w:pPr>
+            <w:r>
+              <w:rPr>
+                <w:b/>
+                <w:bCs/>
+                <w:color w:val="FFFFFF"/>
+                <w:sz w:val="20"/>
+                <w:szCs w:val="20"/>
+              </w:rPr>
+              <w:t xml:space="preserve">Via KEGG</w:t>
+            </w:r>
+          </w:p>
+        </w:tc>
+        <w:tc>
+          <w:tcPr>
+            <w:tcW w:type="dxa" w:w="2500"/>
+            <w:shd w:fill="1F3864" w:val="clear"/>
+            <w:tcMar>
+              <w:top w:type="dxa" w:w="80"/>
+              <w:left w:type="dxa" w:w="100"/>
+              <w:bottom w:type="dxa" w:w="80"/>
+              <w:right w:type="dxa" w:w="100"/>
+            </w:tcMar>
+            <w:vAlign w:val="center"/>
+          </w:tcPr>
+          <w:p>
+            <w:pPr>
+              <w:jc w:val="left"/>
+            </w:pPr>
+            <w:r>
+              <w:rPr>
+                <w:b/>
+                <w:bCs/>
+                <w:color w:val="FFFFFF"/>
+                <w:sz w:val="20"/>
+                <w:szCs w:val="20"/>
+              </w:rPr>
+              <w:t xml:space="preserve">NES POP</w:t>
+            </w:r>
+          </w:p>
+        </w:tc>
+        <w:tc>
+          <w:tcPr>
+            <w:tcW w:type="dxa" w:w="2500"/>
+            <w:shd w:fill="1F3864" w:val="clear"/>
+            <w:tcMar>
+              <w:top w:type="dxa" w:w="80"/>
+              <w:left w:type="dxa" w:w="100"/>
+              <w:bottom w:type="dxa" w:w="80"/>
+              <w:right w:type="dxa" w:w="100"/>
+            </w:tcMar>
+            <w:vAlign w:val="center"/>
+          </w:tcPr>
+          <w:p>
+            <w:pPr>
+              <w:jc w:val="left"/>
+            </w:pPr>
+            <w:r>
+              <w:rPr>
+                <w:b/>
+                <w:bCs/>
+                <w:color w:val="FFFFFF"/>
+                <w:sz w:val="20"/>
+                <w:szCs w:val="20"/>
+              </w:rPr>
+              <w:t xml:space="preserve">NES SUI</w:t>
+            </w:r>
+          </w:p>
+        </w:tc>
+        <w:tc>
+          <w:tcPr>
+            <w:tcW w:type="dxa" w:w="2300"/>
+            <w:shd w:fill="1F3864" w:val="clear"/>
+            <w:tcMar>
+              <w:top w:type="dxa" w:w="80"/>
+              <w:left w:type="dxa" w:w="100"/>
+              <w:bottom w:type="dxa" w:w="80"/>
+              <w:right w:type="dxa" w:w="100"/>
+            </w:tcMar>
+            <w:vAlign w:val="center"/>
+          </w:tcPr>
+          <w:p>
+            <w:pPr>
+              <w:jc w:val="left"/>
+            </w:pPr>
+            <w:r>
+              <w:rPr>
+                <w:b/>
+                <w:bCs/>
+                <w:color w:val="FFFFFF"/>
+                <w:sz w:val="20"/>
+                <w:szCs w:val="20"/>
+              </w:rPr>
+              <w:t xml:space="preserve">Direção</w:t>
+            </w:r>
+          </w:p>
+        </w:tc>
+      </w:tr>
+      <w:tr>
+        <w:tc>
+          <w:tcPr>
+            <w:tcW w:type="dxa" w:w="3600"/>
+            <w:shd w:fill="FFFFFF" w:val="clear"/>
+            <w:tcMar>
+              <w:top w:type="dxa" w:w="80"/>
+              <w:left w:type="dxa" w:w="100"/>
+              <w:bottom w:type="dxa" w:w="80"/>
+              <w:right w:type="dxa" w:w="100"/>
+            </w:tcMar>
+            <w:vAlign w:val="center"/>
+          </w:tcPr>
+          <w:p>
+            <w:pPr>
+              <w:jc w:val="left"/>
+            </w:pPr>
+            <w:r>
+              <w:rPr>
+                <w:b w:val="false"/>
+                <w:bCs w:val="false"/>
+                <w:color w:val="000000"/>
+                <w:sz w:val="19"/>
+                <w:szCs w:val="19"/>
+              </w:rPr>
+              <w:t xml:space="preserve">ErbB signaling pathway</w:t>
+            </w:r>
+          </w:p>
+        </w:tc>
+        <w:tc>
+          <w:tcPr>
+            <w:tcW w:type="dxa" w:w="2500"/>
+            <w:shd w:fill="FFFFFF" w:val="clear"/>
+            <w:tcMar>
+              <w:top w:type="dxa" w:w="80"/>
+              <w:left w:type="dxa" w:w="100"/>
+              <w:bottom w:type="dxa" w:w="80"/>
+              <w:right w:type="dxa" w:w="100"/>
+            </w:tcMar>
+            <w:vAlign w:val="center"/>
+          </w:tcPr>
+          <w:p>
+            <w:pPr>
+              <w:jc w:val="left"/>
+            </w:pPr>
+            <w:r>
+              <w:rPr>
+                <w:b w:val="false"/>
+                <w:bCs w:val="false"/>
+                <w:color w:val="000000"/>
+                <w:sz w:val="19"/>
+                <w:szCs w:val="19"/>
+              </w:rPr>
+              <w:t xml:space="preserve">-1,41</w:t>
+            </w:r>
+          </w:p>
+        </w:tc>
+        <w:tc>
+          <w:tcPr>
+            <w:tcW w:type="dxa" w:w="2500"/>
+            <w:shd w:fill="FFFFFF" w:val="clear"/>
+            <w:tcMar>
+              <w:top w:type="dxa" w:w="80"/>
+              <w:left w:type="dxa" w:w="100"/>
+              <w:bottom w:type="dxa" w:w="80"/>
+              <w:right w:type="dxa" w:w="100"/>
+            </w:tcMar>
+            <w:vAlign w:val="center"/>
+          </w:tcPr>
+          <w:p>
+            <w:pPr>
+              <w:jc w:val="left"/>
+            </w:pPr>
+            <w:r>
+              <w:rPr>
+                <w:b w:val="false"/>
+                <w:bCs w:val="false"/>
+                <w:color w:val="000000"/>
+                <w:sz w:val="19"/>
+                <w:szCs w:val="19"/>
+              </w:rPr>
+              <w:t xml:space="preserve">-1,60</w:t>
+            </w:r>
+          </w:p>
+        </w:tc>
+        <w:tc>
+          <w:tcPr>
+            <w:tcW w:type="dxa" w:w="2300"/>
+            <w:shd w:fill="FFFFFF" w:val="clear"/>
+            <w:tcMar>
+              <w:top w:type="dxa" w:w="80"/>
+              <w:left w:type="dxa" w:w="100"/>
+              <w:bottom w:type="dxa" w:w="80"/>
+              <w:right w:type="dxa" w:w="100"/>
+            </w:tcMar>
+            <w:vAlign w:val="center"/>
+          </w:tcPr>
+          <w:p>
+            <w:pPr>
+              <w:jc w:val="left"/>
+            </w:pPr>
+            <w:r>
+              <w:rPr>
+                <w:b w:val="false"/>
+                <w:bCs w:val="false"/>
+                <w:color w:val="000000"/>
+                <w:sz w:val="19"/>
+                <w:szCs w:val="19"/>
+              </w:rPr>
+              <w:t xml:space="preserve">concordante (baixo)</w:t>
+            </w:r>
+          </w:p>
+        </w:tc>
+      </w:tr>
+      <w:tr>
+        <w:tc>
+          <w:tcPr>
+            <w:tcW w:type="dxa" w:w="3600"/>
+            <w:shd w:fill="DCE6F1" w:val="clear"/>
+            <w:tcMar>
+              <w:top w:type="dxa" w:w="80"/>
+              <w:left w:type="dxa" w:w="100"/>
+              <w:bottom w:type="dxa" w:w="80"/>
+              <w:right w:type="dxa" w:w="100"/>
+            </w:tcMar>
+            <w:vAlign w:val="center"/>
+          </w:tcPr>
+          <w:p>
+            <w:pPr>
+              <w:jc w:val="left"/>
+            </w:pPr>
+            <w:r>
+              <w:rPr>
+                <w:b w:val="false"/>
+                <w:bCs w:val="false"/>
+                <w:color w:val="000000"/>
+                <w:sz w:val="19"/>
+                <w:szCs w:val="19"/>
+              </w:rPr>
+              <w:t xml:space="preserve">Vascular smooth muscle contraction</w:t>
+            </w:r>
+          </w:p>
+        </w:tc>
+        <w:tc>
+          <w:tcPr>
+            <w:tcW w:type="dxa" w:w="2500"/>
+            <w:shd w:fill="DCE6F1" w:val="clear"/>
+            <w:tcMar>
+              <w:top w:type="dxa" w:w="80"/>
+              <w:left w:type="dxa" w:w="100"/>
+              <w:bottom w:type="dxa" w:w="80"/>
+              <w:right w:type="dxa" w:w="100"/>
+            </w:tcMar>
+            <w:vAlign w:val="center"/>
+          </w:tcPr>
+          <w:p>
+            <w:pPr>
+              <w:jc w:val="left"/>
+            </w:pPr>
+            <w:r>
+              <w:rPr>
+                <w:b w:val="false"/>
+                <w:bCs w:val="false"/>
+                <w:color w:val="000000"/>
+                <w:sz w:val="19"/>
+                <w:szCs w:val="19"/>
+              </w:rPr>
+              <w:t xml:space="preserve">-1,98</w:t>
+            </w:r>
+          </w:p>
+        </w:tc>
+        <w:tc>
+          <w:tcPr>
+            <w:tcW w:type="dxa" w:w="2500"/>
+            <w:shd w:fill="DCE6F1" w:val="clear"/>
+            <w:tcMar>
+              <w:top w:type="dxa" w:w="80"/>
+              <w:left w:type="dxa" w:w="100"/>
+              <w:bottom w:type="dxa" w:w="80"/>
+              <w:right w:type="dxa" w:w="100"/>
+            </w:tcMar>
+            <w:vAlign w:val="center"/>
+          </w:tcPr>
+          <w:p>
+            <w:pPr>
+              <w:jc w:val="left"/>
+            </w:pPr>
+            <w:r>
+              <w:rPr>
+                <w:b w:val="false"/>
+                <w:bCs w:val="false"/>
+                <w:color w:val="000000"/>
+                <w:sz w:val="19"/>
+                <w:szCs w:val="19"/>
+              </w:rPr>
+              <w:t xml:space="preserve">-1,68</w:t>
+            </w:r>
+          </w:p>
+        </w:tc>
+        <w:tc>
+          <w:tcPr>
+            <w:tcW w:type="dxa" w:w="2300"/>
+            <w:shd w:fill="DCE6F1" w:val="clear"/>
+            <w:tcMar>
+              <w:top w:type="dxa" w:w="80"/>
+              <w:left w:type="dxa" w:w="100"/>
+              <w:bottom w:type="dxa" w:w="80"/>
+              <w:right w:type="dxa" w:w="100"/>
+            </w:tcMar>
+            <w:vAlign w:val="center"/>
+          </w:tcPr>
+          <w:p>
+            <w:pPr>
+              <w:jc w:val="left"/>
+            </w:pPr>
+            <w:r>
+              <w:rPr>
+                <w:b w:val="false"/>
+                <w:bCs w:val="false"/>
+                <w:color w:val="000000"/>
+                <w:sz w:val="19"/>
+                <w:szCs w:val="19"/>
+              </w:rPr>
+              <w:t xml:space="preserve">concordante (baixo)</w:t>
+            </w:r>
+          </w:p>
+        </w:tc>
+      </w:tr>
+      <w:tr>
+        <w:tc>
+          <w:tcPr>
+            <w:tcW w:type="dxa" w:w="3600"/>
+            <w:shd w:fill="FFFFFF" w:val="clear"/>
+            <w:tcMar>
+              <w:top w:type="dxa" w:w="80"/>
+              <w:left w:type="dxa" w:w="100"/>
+              <w:bottom w:type="dxa" w:w="80"/>
+              <w:right w:type="dxa" w:w="100"/>
+            </w:tcMar>
+            <w:vAlign w:val="center"/>
+          </w:tcPr>
+          <w:p>
+            <w:pPr>
+              <w:jc w:val="left"/>
+            </w:pPr>
+            <w:r>
+              <w:rPr>
+                <w:b w:val="false"/>
+                <w:bCs w:val="false"/>
+                <w:color w:val="000000"/>
+                <w:sz w:val="19"/>
+                <w:szCs w:val="19"/>
+              </w:rPr>
+              <w:t xml:space="preserve">Wnt signaling pathway</w:t>
+            </w:r>
+          </w:p>
+        </w:tc>
+        <w:tc>
+          <w:tcPr>
+            <w:tcW w:type="dxa" w:w="2500"/>
+            <w:shd w:fill="FFFFFF" w:val="clear"/>
+            <w:tcMar>
+              <w:top w:type="dxa" w:w="80"/>
+              <w:left w:type="dxa" w:w="100"/>
+              <w:bottom w:type="dxa" w:w="80"/>
+              <w:right w:type="dxa" w:w="100"/>
+            </w:tcMar>
+            <w:vAlign w:val="center"/>
+          </w:tcPr>
+          <w:p>
+            <w:pPr>
+              <w:jc w:val="left"/>
+            </w:pPr>
+            <w:r>
+              <w:rPr>
+                <w:b w:val="false"/>
+                <w:bCs w:val="false"/>
+                <w:color w:val="000000"/>
+                <w:sz w:val="19"/>
+                <w:szCs w:val="19"/>
+              </w:rPr>
+              <w:t xml:space="preserve">-0,85</w:t>
+            </w:r>
+          </w:p>
+        </w:tc>
+        <w:tc>
+          <w:tcPr>
+            <w:tcW w:type="dxa" w:w="2500"/>
+            <w:shd w:fill="FFFFFF" w:val="clear"/>
+            <w:tcMar>
+              <w:top w:type="dxa" w:w="80"/>
+              <w:left w:type="dxa" w:w="100"/>
+              <w:bottom w:type="dxa" w:w="80"/>
+              <w:right w:type="dxa" w:w="100"/>
+            </w:tcMar>
+            <w:vAlign w:val="center"/>
+          </w:tcPr>
+          <w:p>
+            <w:pPr>
+              <w:jc w:val="left"/>
+            </w:pPr>
+            <w:r>
+              <w:rPr>
+                <w:b w:val="false"/>
+                <w:bCs w:val="false"/>
+                <w:color w:val="000000"/>
+                <w:sz w:val="19"/>
+                <w:szCs w:val="19"/>
+              </w:rPr>
+              <w:t xml:space="preserve">-1,39</w:t>
+            </w:r>
+          </w:p>
+        </w:tc>
+        <w:tc>
+          <w:tcPr>
+            <w:tcW w:type="dxa" w:w="2300"/>
+            <w:shd w:fill="FFFFFF" w:val="clear"/>
+            <w:tcMar>
+              <w:top w:type="dxa" w:w="80"/>
+              <w:left w:type="dxa" w:w="100"/>
+              <w:bottom w:type="dxa" w:w="80"/>
+              <w:right w:type="dxa" w:w="100"/>
+            </w:tcMar>
+            <w:vAlign w:val="center"/>
+          </w:tcPr>
+          <w:p>
+            <w:pPr>
+              <w:jc w:val="left"/>
+            </w:pPr>
+            <w:r>
+              <w:rPr>
+                <w:b w:val="false"/>
+                <w:bCs w:val="false"/>
+                <w:color w:val="000000"/>
+                <w:sz w:val="19"/>
+                <w:szCs w:val="19"/>
+              </w:rPr>
+              <w:t xml:space="preserve">concordante (baixo)</w:t>
+            </w:r>
+          </w:p>
+        </w:tc>
+      </w:tr>
+      <w:tr>
+        <w:tc>
+          <w:tcPr>
+            <w:tcW w:type="dxa" w:w="3600"/>
+            <w:shd w:fill="DCE6F1" w:val="clear"/>
+            <w:tcMar>
+              <w:top w:type="dxa" w:w="80"/>
+              <w:left w:type="dxa" w:w="100"/>
+              <w:bottom w:type="dxa" w:w="80"/>
+              <w:right w:type="dxa" w:w="100"/>
+            </w:tcMar>
+            <w:vAlign w:val="center"/>
+          </w:tcPr>
+          <w:p>
+            <w:pPr>
+              <w:jc w:val="left"/>
+            </w:pPr>
+            <w:r>
+              <w:rPr>
+                <w:b w:val="false"/>
+                <w:bCs w:val="false"/>
+                <w:color w:val="000000"/>
+                <w:sz w:val="19"/>
+                <w:szCs w:val="19"/>
+              </w:rPr>
+              <w:t xml:space="preserve">VEGF signaling pathway</w:t>
+            </w:r>
+          </w:p>
+        </w:tc>
+        <w:tc>
+          <w:tcPr>
+            <w:tcW w:type="dxa" w:w="2500"/>
+            <w:shd w:fill="DCE6F1" w:val="clear"/>
+            <w:tcMar>
+              <w:top w:type="dxa" w:w="80"/>
+              <w:left w:type="dxa" w:w="100"/>
+              <w:bottom w:type="dxa" w:w="80"/>
+              <w:right w:type="dxa" w:w="100"/>
+            </w:tcMar>
+            <w:vAlign w:val="center"/>
+          </w:tcPr>
+          <w:p>
+            <w:pPr>
+              <w:jc w:val="left"/>
+            </w:pPr>
+            <w:r>
+              <w:rPr>
+                <w:b w:val="false"/>
+                <w:bCs w:val="false"/>
+                <w:color w:val="000000"/>
+                <w:sz w:val="19"/>
+                <w:szCs w:val="19"/>
+              </w:rPr>
+              <w:t xml:space="preserve">-0,88</w:t>
+            </w:r>
+          </w:p>
+        </w:tc>
+        <w:tc>
+          <w:tcPr>
+            <w:tcW w:type="dxa" w:w="2500"/>
+            <w:shd w:fill="DCE6F1" w:val="clear"/>
+            <w:tcMar>
+              <w:top w:type="dxa" w:w="80"/>
+              <w:left w:type="dxa" w:w="100"/>
+              <w:bottom w:type="dxa" w:w="80"/>
+              <w:right w:type="dxa" w:w="100"/>
+            </w:tcMar>
+            <w:vAlign w:val="center"/>
+          </w:tcPr>
+          <w:p>
+            <w:pPr>
+              <w:jc w:val="left"/>
+            </w:pPr>
+            <w:r>
+              <w:rPr>
+                <w:b w:val="false"/>
+                <w:bCs w:val="false"/>
+                <w:color w:val="000000"/>
+                <w:sz w:val="19"/>
+                <w:szCs w:val="19"/>
+              </w:rPr>
+              <w:t xml:space="preserve">-1,33</w:t>
+            </w:r>
+          </w:p>
+        </w:tc>
+        <w:tc>
+          <w:tcPr>
+            <w:tcW w:type="dxa" w:w="2300"/>
+            <w:shd w:fill="DCE6F1" w:val="clear"/>
+            <w:tcMar>
+              <w:top w:type="dxa" w:w="80"/>
+              <w:left w:type="dxa" w:w="100"/>
+              <w:bottom w:type="dxa" w:w="80"/>
+              <w:right w:type="dxa" w:w="100"/>
+            </w:tcMar>
+            <w:vAlign w:val="center"/>
+          </w:tcPr>
+          <w:p>
+            <w:pPr>
+              <w:jc w:val="left"/>
+            </w:pPr>
+            <w:r>
+              <w:rPr>
+                <w:b w:val="false"/>
+                <w:bCs w:val="false"/>
+                <w:color w:val="000000"/>
+                <w:sz w:val="19"/>
+                <w:szCs w:val="19"/>
+              </w:rPr>
+              <w:t xml:space="preserve">concordante (baixo)</w:t>
+            </w:r>
+          </w:p>
+        </w:tc>
+      </w:tr>
+      <w:tr>
+        <w:tc>
+          <w:tcPr>
+            <w:tcW w:type="dxa" w:w="3600"/>
+            <w:shd w:fill="FFFFFF" w:val="clear"/>
+            <w:tcMar>
+              <w:top w:type="dxa" w:w="80"/>
+              <w:left w:type="dxa" w:w="100"/>
+              <w:bottom w:type="dxa" w:w="80"/>
+              <w:right w:type="dxa" w:w="100"/>
+            </w:tcMar>
+            <w:vAlign w:val="center"/>
+          </w:tcPr>
+          <w:p>
+            <w:pPr>
+              <w:jc w:val="left"/>
+            </w:pPr>
+            <w:r>
+              <w:rPr>
+                <w:b w:val="false"/>
+                <w:bCs w:val="false"/>
+                <w:color w:val="000000"/>
+                <w:sz w:val="19"/>
+                <w:szCs w:val="19"/>
+              </w:rPr>
+              <w:t xml:space="preserve">ECM-receptor interaction</w:t>
+            </w:r>
+          </w:p>
+        </w:tc>
+        <w:tc>
+          <w:tcPr>
+            <w:tcW w:type="dxa" w:w="2500"/>
+            <w:shd w:fill="FFFFFF" w:val="clear"/>
+            <w:tcMar>
+              <w:top w:type="dxa" w:w="80"/>
+              <w:left w:type="dxa" w:w="100"/>
+              <w:bottom w:type="dxa" w:w="80"/>
+              <w:right w:type="dxa" w:w="100"/>
+            </w:tcMar>
+            <w:vAlign w:val="center"/>
+          </w:tcPr>
+          <w:p>
+            <w:pPr>
+              <w:jc w:val="left"/>
+            </w:pPr>
+            <w:r>
+              <w:rPr>
+                <w:b w:val="false"/>
+                <w:bCs w:val="false"/>
+                <w:color w:val="000000"/>
+                <w:sz w:val="19"/>
+                <w:szCs w:val="19"/>
+              </w:rPr>
+              <w:t xml:space="preserve">-0,66</w:t>
+            </w:r>
+          </w:p>
+        </w:tc>
+        <w:tc>
+          <w:tcPr>
+            <w:tcW w:type="dxa" w:w="2500"/>
+            <w:shd w:fill="FFFFFF" w:val="clear"/>
+            <w:tcMar>
+              <w:top w:type="dxa" w:w="80"/>
+              <w:left w:type="dxa" w:w="100"/>
+              <w:bottom w:type="dxa" w:w="80"/>
+              <w:right w:type="dxa" w:w="100"/>
+            </w:tcMar>
+            <w:vAlign w:val="center"/>
+          </w:tcPr>
+          <w:p>
+            <w:pPr>
+              <w:jc w:val="left"/>
+            </w:pPr>
+            <w:r>
+              <w:rPr>
+                <w:b w:val="false"/>
+                <w:bCs w:val="false"/>
+                <w:color w:val="000000"/>
+                <w:sz w:val="19"/>
+                <w:szCs w:val="19"/>
+              </w:rPr>
+              <w:t xml:space="preserve">-1,64</w:t>
+            </w:r>
+          </w:p>
+        </w:tc>
+        <w:tc>
+          <w:tcPr>
+            <w:tcW w:type="dxa" w:w="2300"/>
+            <w:shd w:fill="FFFFFF" w:val="clear"/>
+            <w:tcMar>
+              <w:top w:type="dxa" w:w="80"/>
+              <w:left w:type="dxa" w:w="100"/>
+              <w:bottom w:type="dxa" w:w="80"/>
+              <w:right w:type="dxa" w:w="100"/>
+            </w:tcMar>
+            <w:vAlign w:val="center"/>
+          </w:tcPr>
+          <w:p>
+            <w:pPr>
+              <w:jc w:val="left"/>
+            </w:pPr>
+            <w:r>
+              <w:rPr>
+                <w:b w:val="false"/>
+                <w:bCs w:val="false"/>
+                <w:color w:val="000000"/>
+                <w:sz w:val="19"/>
+                <w:szCs w:val="19"/>
+              </w:rPr>
+              <w:t xml:space="preserve">concordante (baixo)</w:t>
+            </w:r>
+          </w:p>
+        </w:tc>
+      </w:tr>
+      <w:tr>
+        <w:tc>
+          <w:tcPr>
+            <w:tcW w:type="dxa" w:w="3600"/>
+            <w:shd w:fill="DCE6F1" w:val="clear"/>
+            <w:tcMar>
+              <w:top w:type="dxa" w:w="80"/>
+              <w:left w:type="dxa" w:w="100"/>
+              <w:bottom w:type="dxa" w:w="80"/>
+              <w:right w:type="dxa" w:w="100"/>
+            </w:tcMar>
+            <w:vAlign w:val="center"/>
+          </w:tcPr>
+          <w:p>
+            <w:pPr>
+              <w:jc w:val="left"/>
+            </w:pPr>
+            <w:r>
+              <w:rPr>
+                <w:b w:val="false"/>
+                <w:bCs w:val="false"/>
+                <w:color w:val="000000"/>
+                <w:sz w:val="19"/>
+                <w:szCs w:val="19"/>
+              </w:rPr>
+              <w:t xml:space="preserve">Fc gamma R-mediated phagosome formation</w:t>
+            </w:r>
+          </w:p>
+        </w:tc>
+        <w:tc>
+          <w:tcPr>
+            <w:tcW w:type="dxa" w:w="2500"/>
+            <w:shd w:fill="DCE6F1" w:val="clear"/>
+            <w:tcMar>
+              <w:top w:type="dxa" w:w="80"/>
+              <w:left w:type="dxa" w:w="100"/>
+              <w:bottom w:type="dxa" w:w="80"/>
+              <w:right w:type="dxa" w:w="100"/>
+            </w:tcMar>
+            <w:vAlign w:val="center"/>
+          </w:tcPr>
+          <w:p>
+            <w:pPr>
+              <w:jc w:val="left"/>
+            </w:pPr>
+            <w:r>
+              <w:rPr>
+                <w:b w:val="false"/>
+                <w:bCs w:val="false"/>
+                <w:color w:val="000000"/>
+                <w:sz w:val="19"/>
+                <w:szCs w:val="19"/>
+              </w:rPr>
+              <w:t xml:space="preserve">-1,14</w:t>
+            </w:r>
+          </w:p>
+        </w:tc>
+        <w:tc>
+          <w:tcPr>
+            <w:tcW w:type="dxa" w:w="2500"/>
+            <w:shd w:fill="DCE6F1" w:val="clear"/>
+            <w:tcMar>
+              <w:top w:type="dxa" w:w="80"/>
+              <w:left w:type="dxa" w:w="100"/>
+              <w:bottom w:type="dxa" w:w="80"/>
+              <w:right w:type="dxa" w:w="100"/>
+            </w:tcMar>
+            <w:vAlign w:val="center"/>
+          </w:tcPr>
+          <w:p>
+            <w:pPr>
+              <w:jc w:val="left"/>
+            </w:pPr>
+            <w:r>
+              <w:rPr>
+                <w:b w:val="false"/>
+                <w:bCs w:val="false"/>
+                <w:color w:val="000000"/>
+                <w:sz w:val="19"/>
+                <w:szCs w:val="19"/>
+              </w:rPr>
+              <w:t xml:space="preserve">-1,52</w:t>
+            </w:r>
+          </w:p>
+        </w:tc>
+        <w:tc>
+          <w:tcPr>
+            <w:tcW w:type="dxa" w:w="2300"/>
+            <w:shd w:fill="DCE6F1" w:val="clear"/>
+            <w:tcMar>
+              <w:top w:type="dxa" w:w="80"/>
+              <w:left w:type="dxa" w:w="100"/>
+              <w:bottom w:type="dxa" w:w="80"/>
+              <w:right w:type="dxa" w:w="100"/>
+            </w:tcMar>
+            <w:vAlign w:val="center"/>
+          </w:tcPr>
+          <w:p>
+            <w:pPr>
+              <w:jc w:val="left"/>
+            </w:pPr>
+            <w:r>
+              <w:rPr>
+                <w:b w:val="false"/>
+                <w:bCs w:val="false"/>
+                <w:color w:val="000000"/>
+                <w:sz w:val="19"/>
+                <w:szCs w:val="19"/>
+              </w:rPr>
+              <w:t xml:space="preserve">concordante (baixo)</w:t>
+            </w:r>
+          </w:p>
+        </w:tc>
+      </w:tr>
+      <w:tr>
+        <w:tc>
+          <w:tcPr>
+            <w:tcW w:type="dxa" w:w="3600"/>
+            <w:shd w:fill="FFFFFF" w:val="clear"/>
+            <w:tcMar>
+              <w:top w:type="dxa" w:w="80"/>
+              <w:left w:type="dxa" w:w="100"/>
+              <w:bottom w:type="dxa" w:w="80"/>
+              <w:right w:type="dxa" w:w="100"/>
+            </w:tcMar>
+            <w:vAlign w:val="center"/>
+          </w:tcPr>
+          <w:p>
+            <w:pPr>
+              <w:jc w:val="left"/>
+            </w:pPr>
+            <w:r>
+              <w:rPr>
+                <w:b w:val="false"/>
+                <w:bCs w:val="false"/>
+                <w:color w:val="000000"/>
+                <w:sz w:val="19"/>
+                <w:szCs w:val="19"/>
+              </w:rPr>
+              <w:t xml:space="preserve">Regulation of actin cytoskeleton</w:t>
+            </w:r>
+          </w:p>
+        </w:tc>
+        <w:tc>
+          <w:tcPr>
+            <w:tcW w:type="dxa" w:w="2500"/>
+            <w:shd w:fill="FFFFFF" w:val="clear"/>
+            <w:tcMar>
+              <w:top w:type="dxa" w:w="80"/>
+              <w:left w:type="dxa" w:w="100"/>
+              <w:bottom w:type="dxa" w:w="80"/>
+              <w:right w:type="dxa" w:w="100"/>
+            </w:tcMar>
+            <w:vAlign w:val="center"/>
+          </w:tcPr>
+          <w:p>
+            <w:pPr>
+              <w:jc w:val="left"/>
+            </w:pPr>
+            <w:r>
+              <w:rPr>
+                <w:b w:val="false"/>
+                <w:bCs w:val="false"/>
+                <w:color w:val="000000"/>
+                <w:sz w:val="19"/>
+                <w:szCs w:val="19"/>
+              </w:rPr>
+              <w:t xml:space="preserve">-1,15</w:t>
+            </w:r>
+          </w:p>
+        </w:tc>
+        <w:tc>
+          <w:tcPr>
+            <w:tcW w:type="dxa" w:w="2500"/>
+            <w:shd w:fill="FFFFFF" w:val="clear"/>
+            <w:tcMar>
+              <w:top w:type="dxa" w:w="80"/>
+              <w:left w:type="dxa" w:w="100"/>
+              <w:bottom w:type="dxa" w:w="80"/>
+              <w:right w:type="dxa" w:w="100"/>
+            </w:tcMar>
+            <w:vAlign w:val="center"/>
+          </w:tcPr>
+          <w:p>
+            <w:pPr>
+              <w:jc w:val="left"/>
+            </w:pPr>
+            <w:r>
+              <w:rPr>
+                <w:b w:val="false"/>
+                <w:bCs w:val="false"/>
+                <w:color w:val="000000"/>
+                <w:sz w:val="19"/>
+                <w:szCs w:val="19"/>
+              </w:rPr>
+              <w:t xml:space="preserve">-1,80</w:t>
+            </w:r>
+          </w:p>
+        </w:tc>
+        <w:tc>
+          <w:tcPr>
+            <w:tcW w:type="dxa" w:w="2300"/>
+            <w:shd w:fill="FFFFFF" w:val="clear"/>
+            <w:tcMar>
+              <w:top w:type="dxa" w:w="80"/>
+              <w:left w:type="dxa" w:w="100"/>
+              <w:bottom w:type="dxa" w:w="80"/>
+              <w:right w:type="dxa" w:w="100"/>
+            </w:tcMar>
+            <w:vAlign w:val="center"/>
+          </w:tcPr>
+          <w:p>
+            <w:pPr>
+              <w:jc w:val="left"/>
+            </w:pPr>
+            <w:r>
+              <w:rPr>
+                <w:b w:val="false"/>
+                <w:bCs w:val="false"/>
+                <w:color w:val="000000"/>
+                <w:sz w:val="19"/>
+                <w:szCs w:val="19"/>
+              </w:rPr>
+              <w:t xml:space="preserve">concordante (baixo)</w:t>
+            </w:r>
+          </w:p>
+        </w:tc>
+      </w:tr>
+      <w:tr>
+        <w:tc>
+          <w:tcPr>
+            <w:tcW w:type="dxa" w:w="3600"/>
+            <w:shd w:fill="DCE6F1" w:val="clear"/>
+            <w:tcMar>
+              <w:top w:type="dxa" w:w="80"/>
+              <w:left w:type="dxa" w:w="100"/>
+              <w:bottom w:type="dxa" w:w="80"/>
+              <w:right w:type="dxa" w:w="100"/>
+            </w:tcMar>
+            <w:vAlign w:val="center"/>
+          </w:tcPr>
+          <w:p>
+            <w:pPr>
+              <w:jc w:val="left"/>
+            </w:pPr>
+            <w:r>
+              <w:rPr>
+                <w:b w:val="false"/>
+                <w:bCs w:val="false"/>
+                <w:color w:val="000000"/>
+                <w:sz w:val="19"/>
+                <w:szCs w:val="19"/>
+              </w:rPr>
+              <w:t xml:space="preserve">Prostate cancer</w:t>
+            </w:r>
+          </w:p>
+        </w:tc>
+        <w:tc>
+          <w:tcPr>
+            <w:tcW w:type="dxa" w:w="2500"/>
+            <w:shd w:fill="DCE6F1" w:val="clear"/>
+            <w:tcMar>
+              <w:top w:type="dxa" w:w="80"/>
+              <w:left w:type="dxa" w:w="100"/>
+              <w:bottom w:type="dxa" w:w="80"/>
+              <w:right w:type="dxa" w:w="100"/>
+            </w:tcMar>
+            <w:vAlign w:val="center"/>
+          </w:tcPr>
+          <w:p>
+            <w:pPr>
+              <w:jc w:val="left"/>
+            </w:pPr>
+            <w:r>
+              <w:rPr>
+                <w:b w:val="false"/>
+                <w:bCs w:val="false"/>
+                <w:color w:val="000000"/>
+                <w:sz w:val="19"/>
+                <w:szCs w:val="19"/>
+              </w:rPr>
+              <w:t xml:space="preserve">-1,01</w:t>
+            </w:r>
+          </w:p>
+        </w:tc>
+        <w:tc>
+          <w:tcPr>
+            <w:tcW w:type="dxa" w:w="2500"/>
+            <w:shd w:fill="DCE6F1" w:val="clear"/>
+            <w:tcMar>
+              <w:top w:type="dxa" w:w="80"/>
+              <w:left w:type="dxa" w:w="100"/>
+              <w:bottom w:type="dxa" w:w="80"/>
+              <w:right w:type="dxa" w:w="100"/>
+            </w:tcMar>
+            <w:vAlign w:val="center"/>
+          </w:tcPr>
+          <w:p>
+            <w:pPr>
+              <w:jc w:val="left"/>
+            </w:pPr>
+            <w:r>
+              <w:rPr>
+                <w:b w:val="false"/>
+                <w:bCs w:val="false"/>
+                <w:color w:val="000000"/>
+                <w:sz w:val="19"/>
+                <w:szCs w:val="19"/>
+              </w:rPr>
+              <w:t xml:space="preserve">-1,70</w:t>
+            </w:r>
+          </w:p>
+        </w:tc>
+        <w:tc>
+          <w:tcPr>
+            <w:tcW w:type="dxa" w:w="2300"/>
+            <w:shd w:fill="DCE6F1" w:val="clear"/>
+            <w:tcMar>
+              <w:top w:type="dxa" w:w="80"/>
+              <w:left w:type="dxa" w:w="100"/>
+              <w:bottom w:type="dxa" w:w="80"/>
+              <w:right w:type="dxa" w:w="100"/>
+            </w:tcMar>
+            <w:vAlign w:val="center"/>
+          </w:tcPr>
+          <w:p>
+            <w:pPr>
+              <w:jc w:val="left"/>
+            </w:pPr>
+            <w:r>
+              <w:rPr>
+                <w:b w:val="false"/>
+                <w:bCs w:val="false"/>
+                <w:color w:val="000000"/>
+                <w:sz w:val="19"/>
+                <w:szCs w:val="19"/>
+              </w:rPr>
+              <w:t xml:space="preserve">concordante (baixo)</w:t>
+            </w:r>
+          </w:p>
+        </w:tc>
+      </w:tr>
+      <w:tr>
+        <w:tc>
+          <w:tcPr>
+            <w:tcW w:type="dxa" w:w="3600"/>
+            <w:shd w:fill="FFFFFF" w:val="clear"/>
+            <w:tcMar>
+              <w:top w:type="dxa" w:w="80"/>
+              <w:left w:type="dxa" w:w="100"/>
+              <w:bottom w:type="dxa" w:w="80"/>
+              <w:right w:type="dxa" w:w="100"/>
+            </w:tcMar>
+            <w:vAlign w:val="center"/>
+          </w:tcPr>
+          <w:p>
+            <w:pPr>
+              <w:jc w:val="left"/>
+            </w:pPr>
+            <w:r>
+              <w:rPr>
+                <w:b w:val="false"/>
+                <w:bCs w:val="false"/>
+                <w:color w:val="000000"/>
+                <w:sz w:val="19"/>
+                <w:szCs w:val="19"/>
+              </w:rPr>
+              <w:t xml:space="preserve">Melanoma</w:t>
+            </w:r>
+          </w:p>
+        </w:tc>
+        <w:tc>
+          <w:tcPr>
+            <w:tcW w:type="dxa" w:w="2500"/>
+            <w:shd w:fill="FFFFFF" w:val="clear"/>
+            <w:tcMar>
+              <w:top w:type="dxa" w:w="80"/>
+              <w:left w:type="dxa" w:w="100"/>
+              <w:bottom w:type="dxa" w:w="80"/>
+              <w:right w:type="dxa" w:w="100"/>
+            </w:tcMar>
+            <w:vAlign w:val="center"/>
+          </w:tcPr>
+          <w:p>
+            <w:pPr>
+              <w:jc w:val="left"/>
+            </w:pPr>
+            <w:r>
+              <w:rPr>
+                <w:b w:val="false"/>
+                <w:bCs w:val="false"/>
+                <w:color w:val="000000"/>
+                <w:sz w:val="19"/>
+                <w:szCs w:val="19"/>
+              </w:rPr>
+              <w:t xml:space="preserve">-0,76</w:t>
+            </w:r>
+          </w:p>
+        </w:tc>
+        <w:tc>
+          <w:tcPr>
+            <w:tcW w:type="dxa" w:w="2500"/>
+            <w:shd w:fill="FFFFFF" w:val="clear"/>
+            <w:tcMar>
+              <w:top w:type="dxa" w:w="80"/>
+              <w:left w:type="dxa" w:w="100"/>
+              <w:bottom w:type="dxa" w:w="80"/>
+              <w:right w:type="dxa" w:w="100"/>
+            </w:tcMar>
+            <w:vAlign w:val="center"/>
+          </w:tcPr>
+          <w:p>
+            <w:pPr>
+              <w:jc w:val="left"/>
+            </w:pPr>
+            <w:r>
+              <w:rPr>
+                <w:b w:val="false"/>
+                <w:bCs w:val="false"/>
+                <w:color w:val="000000"/>
+                <w:sz w:val="19"/>
+                <w:szCs w:val="19"/>
+              </w:rPr>
+              <w:t xml:space="preserve">-2,05</w:t>
+            </w:r>
+          </w:p>
+        </w:tc>
+        <w:tc>
+          <w:tcPr>
+            <w:tcW w:type="dxa" w:w="2300"/>
+            <w:shd w:fill="FFFFFF" w:val="clear"/>
+            <w:tcMar>
+              <w:top w:type="dxa" w:w="80"/>
+              <w:left w:type="dxa" w:w="100"/>
+              <w:bottom w:type="dxa" w:w="80"/>
+              <w:right w:type="dxa" w:w="100"/>
+            </w:tcMar>
+            <w:vAlign w:val="center"/>
+          </w:tcPr>
+          <w:p>
+            <w:pPr>
+              <w:jc w:val="left"/>
+            </w:pPr>
+            <w:r>
+              <w:rPr>
+                <w:b w:val="false"/>
+                <w:bCs w:val="false"/>
+                <w:color w:val="000000"/>
+                <w:sz w:val="19"/>
+                <w:szCs w:val="19"/>
+              </w:rPr>
+              <w:t xml:space="preserve">concordante (baixo)</w:t>
+            </w:r>
+          </w:p>
+        </w:tc>
+      </w:tr>
+    </w:tbl>
+    <w:p>
+      <w:pPr>
+        <w:spacing w:after="160" w:line="300"/>
+      </w:pPr>
+      <w:r>
+        <w:rPr>
+          <w:i/>
+          <w:iCs/>
+          <w:color w:val="444444"/>
+          <w:sz w:val="21"/>
+          <w:szCs w:val="21"/>
+        </w:rPr>
+        <w:t xml:space="preserve">NES = Normalized Enrichment Score (ver seção 4.4 para a explicação completa de cada estatística). Sinal negativo = via regulada para baixo na doença em relação ao controle.</w:t>
       </w:r>
     </w:p>
     <w:p>
@@ -2260,7 +4183,534 @@
           <w:sz w:val="24"/>
           <w:szCs w:val="24"/>
         </w:rPr>
-        <w:t xml:space="preserve">4.4 GO Biological Process</w:t>
+        <w:t xml:space="preserve">4.4 Como interpretar as estatísticas do fgsea</w:t>
+      </w:r>
+    </w:p>
+    <w:p>
+      <w:pPr>
+        <w:spacing w:after="160" w:line="300"/>
+      </w:pPr>
+      <w:r>
+        <w:rPr>
+          <w:sz w:val="21"/>
+          <w:szCs w:val="21"/>
+        </w:rPr>
+        <w:t xml:space="preserve">Cada via testada pelo fgsea recebe as seguintes medidas:</w:t>
+      </w:r>
+    </w:p>
+    <w:tbl>
+      <w:tblPr>
+        <w:tblW w:type="dxa" w:w="9300"/>
+        <w:tblBorders>
+          <w:top w:val="single" w:color="auto" w:sz="4"/>
+          <w:left w:val="single" w:color="auto" w:sz="4"/>
+          <w:bottom w:val="single" w:color="auto" w:sz="4"/>
+          <w:right w:val="single" w:color="auto" w:sz="4"/>
+          <w:insideH w:val="single" w:color="auto" w:sz="4"/>
+          <w:insideV w:val="single" w:color="auto" w:sz="4"/>
+        </w:tblBorders>
+      </w:tblPr>
+      <w:tblGrid>
+        <w:gridCol w:w="1500"/>
+        <w:gridCol w:w="7800"/>
+      </w:tblGrid>
+      <w:tr>
+        <w:trPr>
+          <w:tblHeader/>
+        </w:trPr>
+        <w:tc>
+          <w:tcPr>
+            <w:tcW w:type="dxa" w:w="1500"/>
+            <w:shd w:fill="1F3864" w:val="clear"/>
+            <w:tcMar>
+              <w:top w:type="dxa" w:w="80"/>
+              <w:left w:type="dxa" w:w="100"/>
+              <w:bottom w:type="dxa" w:w="80"/>
+              <w:right w:type="dxa" w:w="100"/>
+            </w:tcMar>
+            <w:vAlign w:val="center"/>
+          </w:tcPr>
+          <w:p>
+            <w:pPr>
+              <w:jc w:val="left"/>
+            </w:pPr>
+            <w:r>
+              <w:rPr>
+                <w:b/>
+                <w:bCs/>
+                <w:color w:val="FFFFFF"/>
+                <w:sz w:val="20"/>
+                <w:szCs w:val="20"/>
+              </w:rPr>
+              <w:t xml:space="preserve">Coluna</w:t>
+            </w:r>
+          </w:p>
+        </w:tc>
+        <w:tc>
+          <w:tcPr>
+            <w:tcW w:type="dxa" w:w="7800"/>
+            <w:shd w:fill="1F3864" w:val="clear"/>
+            <w:tcMar>
+              <w:top w:type="dxa" w:w="80"/>
+              <w:left w:type="dxa" w:w="100"/>
+              <w:bottom w:type="dxa" w:w="80"/>
+              <w:right w:type="dxa" w:w="100"/>
+            </w:tcMar>
+            <w:vAlign w:val="center"/>
+          </w:tcPr>
+          <w:p>
+            <w:pPr>
+              <w:jc w:val="left"/>
+            </w:pPr>
+            <w:r>
+              <w:rPr>
+                <w:b/>
+                <w:bCs/>
+                <w:color w:val="FFFFFF"/>
+                <w:sz w:val="20"/>
+                <w:szCs w:val="20"/>
+              </w:rPr>
+              <w:t xml:space="preserve">O que significa</w:t>
+            </w:r>
+          </w:p>
+        </w:tc>
+      </w:tr>
+      <w:tr>
+        <w:tc>
+          <w:tcPr>
+            <w:tcW w:type="dxa" w:w="1500"/>
+            <w:shd w:fill="FFFFFF" w:val="clear"/>
+            <w:tcMar>
+              <w:top w:type="dxa" w:w="80"/>
+              <w:left w:type="dxa" w:w="100"/>
+              <w:bottom w:type="dxa" w:w="80"/>
+              <w:right w:type="dxa" w:w="100"/>
+            </w:tcMar>
+            <w:vAlign w:val="center"/>
+          </w:tcPr>
+          <w:p>
+            <w:pPr>
+              <w:jc w:val="left"/>
+            </w:pPr>
+            <w:r>
+              <w:rPr>
+                <w:b w:val="false"/>
+                <w:bCs w:val="false"/>
+                <w:color w:val="000000"/>
+                <w:sz w:val="19"/>
+                <w:szCs w:val="19"/>
+              </w:rPr>
+              <w:t xml:space="preserve">ES (Enrichment Score)</w:t>
+            </w:r>
+          </w:p>
+        </w:tc>
+        <w:tc>
+          <w:tcPr>
+            <w:tcW w:type="dxa" w:w="7800"/>
+            <w:shd w:fill="FFFFFF" w:val="clear"/>
+            <w:tcMar>
+              <w:top w:type="dxa" w:w="80"/>
+              <w:left w:type="dxa" w:w="100"/>
+              <w:bottom w:type="dxa" w:w="80"/>
+              <w:right w:type="dxa" w:w="100"/>
+            </w:tcMar>
+            <w:vAlign w:val="center"/>
+          </w:tcPr>
+          <w:p>
+            <w:pPr>
+              <w:jc w:val="left"/>
+            </w:pPr>
+            <w:r>
+              <w:rPr>
+                <w:b w:val="false"/>
+                <w:bCs w:val="false"/>
+                <w:color w:val="000000"/>
+                <w:sz w:val="19"/>
+                <w:szCs w:val="19"/>
+              </w:rPr>
+              <w:t xml:space="preserve">Pontuação bruta que mede o quanto os genes de uma via se agrupam numa extremidade da lista de genes ordenada por expressão. É a estatística original do método, mas não é diretamente comparável entre vias de tamanhos diferentes.</w:t>
+            </w:r>
+          </w:p>
+        </w:tc>
+      </w:tr>
+      <w:tr>
+        <w:tc>
+          <w:tcPr>
+            <w:tcW w:type="dxa" w:w="1500"/>
+            <w:shd w:fill="DCE6F1" w:val="clear"/>
+            <w:tcMar>
+              <w:top w:type="dxa" w:w="80"/>
+              <w:left w:type="dxa" w:w="100"/>
+              <w:bottom w:type="dxa" w:w="80"/>
+              <w:right w:type="dxa" w:w="100"/>
+            </w:tcMar>
+            <w:vAlign w:val="center"/>
+          </w:tcPr>
+          <w:p>
+            <w:pPr>
+              <w:jc w:val="left"/>
+            </w:pPr>
+            <w:r>
+              <w:rPr>
+                <w:b w:val="false"/>
+                <w:bCs w:val="false"/>
+                <w:color w:val="000000"/>
+                <w:sz w:val="19"/>
+                <w:szCs w:val="19"/>
+              </w:rPr>
+              <w:t xml:space="preserve">NES (Normalized Enrichment Score)</w:t>
+            </w:r>
+          </w:p>
+        </w:tc>
+        <w:tc>
+          <w:tcPr>
+            <w:tcW w:type="dxa" w:w="7800"/>
+            <w:shd w:fill="DCE6F1" w:val="clear"/>
+            <w:tcMar>
+              <w:top w:type="dxa" w:w="80"/>
+              <w:left w:type="dxa" w:w="100"/>
+              <w:bottom w:type="dxa" w:w="80"/>
+              <w:right w:type="dxa" w:w="100"/>
+            </w:tcMar>
+            <w:vAlign w:val="center"/>
+          </w:tcPr>
+          <w:p>
+            <w:pPr>
+              <w:jc w:val="left"/>
+            </w:pPr>
+            <w:r>
+              <w:rPr>
+                <w:b w:val="false"/>
+                <w:bCs w:val="false"/>
+                <w:color w:val="000000"/>
+                <w:sz w:val="19"/>
+                <w:szCs w:val="19"/>
+              </w:rPr>
+              <w:t xml:space="preserve">O ES AJUSTADO pelo tamanho da via — esta é a medida certa para comparar vias diferentes entre si ou entre POP e SUI. O SINAL indica a direção (positivo = via regulada para cima na doença; negativo = para baixo) e a MAGNITUDE indica a força do efeito. É o número mais importante da tabela.</w:t>
+            </w:r>
+          </w:p>
+        </w:tc>
+      </w:tr>
+      <w:tr>
+        <w:tc>
+          <w:tcPr>
+            <w:tcW w:type="dxa" w:w="1500"/>
+            <w:shd w:fill="FFFFFF" w:val="clear"/>
+            <w:tcMar>
+              <w:top w:type="dxa" w:w="80"/>
+              <w:left w:type="dxa" w:w="100"/>
+              <w:bottom w:type="dxa" w:w="80"/>
+              <w:right w:type="dxa" w:w="100"/>
+            </w:tcMar>
+            <w:vAlign w:val="center"/>
+          </w:tcPr>
+          <w:p>
+            <w:pPr>
+              <w:jc w:val="left"/>
+            </w:pPr>
+            <w:r>
+              <w:rPr>
+                <w:b w:val="false"/>
+                <w:bCs w:val="false"/>
+                <w:color w:val="000000"/>
+                <w:sz w:val="19"/>
+                <w:szCs w:val="19"/>
+              </w:rPr>
+              <w:t xml:space="preserve">pval</w:t>
+            </w:r>
+          </w:p>
+        </w:tc>
+        <w:tc>
+          <w:tcPr>
+            <w:tcW w:type="dxa" w:w="7800"/>
+            <w:shd w:fill="FFFFFF" w:val="clear"/>
+            <w:tcMar>
+              <w:top w:type="dxa" w:w="80"/>
+              <w:left w:type="dxa" w:w="100"/>
+              <w:bottom w:type="dxa" w:w="80"/>
+              <w:right w:type="dxa" w:w="100"/>
+            </w:tcMar>
+            <w:vAlign w:val="center"/>
+          </w:tcPr>
+          <w:p>
+            <w:pPr>
+              <w:jc w:val="left"/>
+            </w:pPr>
+            <w:r>
+              <w:rPr>
+                <w:b w:val="false"/>
+                <w:bCs w:val="false"/>
+                <w:color w:val="000000"/>
+                <w:sz w:val="19"/>
+                <w:szCs w:val="19"/>
+              </w:rPr>
+              <w:t xml:space="preserve">Probabilidade de observar esse resultado por puro acaso, ANTES de corrigir por estarmos testando muitas vias ao mesmo tempo (218 no KEGG, milhares no GO).</w:t>
+            </w:r>
+          </w:p>
+        </w:tc>
+      </w:tr>
+      <w:tr>
+        <w:tc>
+          <w:tcPr>
+            <w:tcW w:type="dxa" w:w="1500"/>
+            <w:shd w:fill="DCE6F1" w:val="clear"/>
+            <w:tcMar>
+              <w:top w:type="dxa" w:w="80"/>
+              <w:left w:type="dxa" w:w="100"/>
+              <w:bottom w:type="dxa" w:w="80"/>
+              <w:right w:type="dxa" w:w="100"/>
+            </w:tcMar>
+            <w:vAlign w:val="center"/>
+          </w:tcPr>
+          <w:p>
+            <w:pPr>
+              <w:jc w:val="left"/>
+            </w:pPr>
+            <w:r>
+              <w:rPr>
+                <w:b w:val="false"/>
+                <w:bCs w:val="false"/>
+                <w:color w:val="000000"/>
+                <w:sz w:val="19"/>
+                <w:szCs w:val="19"/>
+              </w:rPr>
+              <w:t xml:space="preserve">padj (também chamado de FDR)</w:t>
+            </w:r>
+          </w:p>
+        </w:tc>
+        <w:tc>
+          <w:tcPr>
+            <w:tcW w:type="dxa" w:w="7800"/>
+            <w:shd w:fill="DCE6F1" w:val="clear"/>
+            <w:tcMar>
+              <w:top w:type="dxa" w:w="80"/>
+              <w:left w:type="dxa" w:w="100"/>
+              <w:bottom w:type="dxa" w:w="80"/>
+              <w:right w:type="dxa" w:w="100"/>
+            </w:tcMar>
+            <w:vAlign w:val="center"/>
+          </w:tcPr>
+          <w:p>
+            <w:pPr>
+              <w:jc w:val="left"/>
+            </w:pPr>
+            <w:r>
+              <w:rPr>
+                <w:b w:val="false"/>
+                <w:bCs w:val="false"/>
+                <w:color w:val="000000"/>
+                <w:sz w:val="19"/>
+                <w:szCs w:val="19"/>
+              </w:rPr>
+              <w:t xml:space="preserve">O pval DEPOIS da correção para múltiplos testes — este é o número que se usa para decidir se uma via é "estatisticamente significativa" ou não. É sempre maior ou igual ao pval.</w:t>
+            </w:r>
+          </w:p>
+        </w:tc>
+      </w:tr>
+      <w:tr>
+        <w:tc>
+          <w:tcPr>
+            <w:tcW w:type="dxa" w:w="1500"/>
+            <w:shd w:fill="FFFFFF" w:val="clear"/>
+            <w:tcMar>
+              <w:top w:type="dxa" w:w="80"/>
+              <w:left w:type="dxa" w:w="100"/>
+              <w:bottom w:type="dxa" w:w="80"/>
+              <w:right w:type="dxa" w:w="100"/>
+            </w:tcMar>
+            <w:vAlign w:val="center"/>
+          </w:tcPr>
+          <w:p>
+            <w:pPr>
+              <w:jc w:val="left"/>
+            </w:pPr>
+            <w:r>
+              <w:rPr>
+                <w:b w:val="false"/>
+                <w:bCs w:val="false"/>
+                <w:color w:val="000000"/>
+                <w:sz w:val="19"/>
+                <w:szCs w:val="19"/>
+              </w:rPr>
+              <w:t xml:space="preserve">log2err</w:t>
+            </w:r>
+          </w:p>
+        </w:tc>
+        <w:tc>
+          <w:tcPr>
+            <w:tcW w:type="dxa" w:w="7800"/>
+            <w:shd w:fill="FFFFFF" w:val="clear"/>
+            <w:tcMar>
+              <w:top w:type="dxa" w:w="80"/>
+              <w:left w:type="dxa" w:w="100"/>
+              <w:bottom w:type="dxa" w:w="80"/>
+              <w:right w:type="dxa" w:w="100"/>
+            </w:tcMar>
+            <w:vAlign w:val="center"/>
+          </w:tcPr>
+          <w:p>
+            <w:pPr>
+              <w:jc w:val="left"/>
+            </w:pPr>
+            <w:r>
+              <w:rPr>
+                <w:b w:val="false"/>
+                <w:bCs w:val="false"/>
+                <w:color w:val="000000"/>
+                <w:sz w:val="19"/>
+                <w:szCs w:val="19"/>
+              </w:rPr>
+              <w:t xml:space="preserve">NÃO é fold-change (mudança de expressão do gene) — é uma medida técnica completamente diferente: o erro-padrão estimado do próprio cálculo do p-valor, em escala log2. Indica o quão preciso/confiável é o p-valor estimado (que é calculado por permutações), não o quanto um gene ou via mudou de expressão.</w:t>
+            </w:r>
+          </w:p>
+        </w:tc>
+      </w:tr>
+      <w:tr>
+        <w:tc>
+          <w:tcPr>
+            <w:tcW w:type="dxa" w:w="1500"/>
+            <w:shd w:fill="DCE6F1" w:val="clear"/>
+            <w:tcMar>
+              <w:top w:type="dxa" w:w="80"/>
+              <w:left w:type="dxa" w:w="100"/>
+              <w:bottom w:type="dxa" w:w="80"/>
+              <w:right w:type="dxa" w:w="100"/>
+            </w:tcMar>
+            <w:vAlign w:val="center"/>
+          </w:tcPr>
+          <w:p>
+            <w:pPr>
+              <w:jc w:val="left"/>
+            </w:pPr>
+            <w:r>
+              <w:rPr>
+                <w:b w:val="false"/>
+                <w:bCs w:val="false"/>
+                <w:color w:val="000000"/>
+                <w:sz w:val="19"/>
+                <w:szCs w:val="19"/>
+              </w:rPr>
+              <w:t xml:space="preserve">size</w:t>
+            </w:r>
+          </w:p>
+        </w:tc>
+        <w:tc>
+          <w:tcPr>
+            <w:tcW w:type="dxa" w:w="7800"/>
+            <w:shd w:fill="DCE6F1" w:val="clear"/>
+            <w:tcMar>
+              <w:top w:type="dxa" w:w="80"/>
+              <w:left w:type="dxa" w:w="100"/>
+              <w:bottom w:type="dxa" w:w="80"/>
+              <w:right w:type="dxa" w:w="100"/>
+            </w:tcMar>
+            <w:vAlign w:val="center"/>
+          </w:tcPr>
+          <w:p>
+            <w:pPr>
+              <w:jc w:val="left"/>
+            </w:pPr>
+            <w:r>
+              <w:rPr>
+                <w:b w:val="false"/>
+                <w:bCs w:val="false"/>
+                <w:color w:val="000000"/>
+                <w:sz w:val="19"/>
+                <w:szCs w:val="19"/>
+              </w:rPr>
+              <w:t xml:space="preserve">Quantos genes daquela via realmente entraram no teste (alguns genes da via podem não estar na lista de genes testada).</w:t>
+            </w:r>
+          </w:p>
+        </w:tc>
+      </w:tr>
+      <w:tr>
+        <w:tc>
+          <w:tcPr>
+            <w:tcW w:type="dxa" w:w="1500"/>
+            <w:shd w:fill="FFFFFF" w:val="clear"/>
+            <w:tcMar>
+              <w:top w:type="dxa" w:w="80"/>
+              <w:left w:type="dxa" w:w="100"/>
+              <w:bottom w:type="dxa" w:w="80"/>
+              <w:right w:type="dxa" w:w="100"/>
+            </w:tcMar>
+            <w:vAlign w:val="center"/>
+          </w:tcPr>
+          <w:p>
+            <w:pPr>
+              <w:jc w:val="left"/>
+            </w:pPr>
+            <w:r>
+              <w:rPr>
+                <w:b w:val="false"/>
+                <w:bCs w:val="false"/>
+                <w:color w:val="000000"/>
+                <w:sz w:val="19"/>
+                <w:szCs w:val="19"/>
+              </w:rPr>
+              <w:t xml:space="preserve">leadingEdge</w:t>
+            </w:r>
+          </w:p>
+        </w:tc>
+        <w:tc>
+          <w:tcPr>
+            <w:tcW w:type="dxa" w:w="7800"/>
+            <w:shd w:fill="FFFFFF" w:val="clear"/>
+            <w:tcMar>
+              <w:top w:type="dxa" w:w="80"/>
+              <w:left w:type="dxa" w:w="100"/>
+              <w:bottom w:type="dxa" w:w="80"/>
+              <w:right w:type="dxa" w:w="100"/>
+            </w:tcMar>
+            <w:vAlign w:val="center"/>
+          </w:tcPr>
+          <w:p>
+            <w:pPr>
+              <w:jc w:val="left"/>
+            </w:pPr>
+            <w:r>
+              <w:rPr>
+                <w:b w:val="false"/>
+                <w:bCs w:val="false"/>
+                <w:color w:val="000000"/>
+                <w:sz w:val="19"/>
+                <w:szCs w:val="19"/>
+              </w:rPr>
+              <w:t xml:space="preserve">Os genes específicos que mais contribuem para o resultado daquela via — os candidatos mais fortes a biomarcador dentro dela.</w:t>
+            </w:r>
+          </w:p>
+        </w:tc>
+      </w:tr>
+    </w:tbl>
+    <w:p>
+      <w:pPr>
+        <w:spacing w:after="160" w:line="300"/>
+      </w:pPr>
+      <w:r>
+        <w:rPr>
+          <w:i/>
+          <w:iCs/>
+          <w:color w:val="444444"/>
+          <w:sz w:val="21"/>
+          <w:szCs w:val="21"/>
+        </w:rPr>
+        <w:t xml:space="preserve">Por que não existe uma coluna de "log2FC" (fold-change) nesta tabela: o log2FC é uma estatística calculada POR GENE (usada nas tabelas de DEG do DESeq2/voom, seção 4.1) — cada gene tem um único valor de fold-change. Uma via biológica não tem um "fold-change" único, porque é formada por dezenas ou centenas de genes que podem mudar em graus diferentes; por isso o GSEA/fgsea usa o NES (que resume o comportamento coletivo de todos os genes da via) no lugar do fold-change.</w:t>
+      </w:r>
+    </w:p>
+    <w:p>
+      <w:pPr>
+        <w:pStyle w:val="Heading2"/>
+        <w:spacing w:after="120" w:before="300"/>
+      </w:pPr>
+      <w:r>
+        <w:rPr>
+          <w:b/>
+          <w:bCs/>
+          <w:color w:val="1F3864"/>
+          <w:sz w:val="24"/>
+          <w:szCs w:val="24"/>
+        </w:rPr>
+        <w:t xml:space="preserve">4.5 GO Biological Process</w:t>
       </w:r>
     </w:p>
     <w:tbl>
@@ -2704,7 +5154,7 @@
           <w:sz w:val="24"/>
           <w:szCs w:val="24"/>
         </w:rPr>
-        <w:t xml:space="preserve">4.5 Achado mais robusto: queratinização / epiderme (POP)</w:t>
+        <w:t xml:space="preserve">4.6 Achado mais robusto: queratinização / epiderme (POP)</w:t>
       </w:r>
     </w:p>
     <w:p>
@@ -2934,7 +5384,7 @@
           <w:sz w:val="21"/>
           <w:szCs w:val="21"/>
         </w:rPr>
-        <w:t xml:space="preserve">A análise identificou uma via biológica plausível de convergência entre POP e SUI centrada em disfunção de matriz extracelular/tecido conjuntivo, com apoio adicional da literatura publicada em single-cell RNA-seq para ambas as condições. O achado mais robusto e replicado (queratinização/diferenciação epidérmica em POP) foi confirmado por três abordagens estatísticas independentes e por um estudo publicado de terceiros. O motor de cálculo do GSEA desenvolvido para este projeto foi validado contra o pacote oficial da comunidade científica (fgsea), com forte concordância. As limitações identificadas são inerentes ao tipo de dado disponível (bulk, não single-cell) e ao tamanho amostral do estudo original de SUI — não a falhas na metodologia aplicada.</w:t>
+        <w:t xml:space="preserve">A análise identificou uma via biológica plausível de convergência entre POP e SUI centrada em disfunção de matriz extracelular/tecido conjuntivo, com apoio adicional da literatura publicada em single-cell RNA-seq para ambas as condições. As 6 vias significativas em ambas as doenças, e as demais 10 vias de interesse verificadas individualmente, apresentam 100% de concordância na direção do efeito entre POP e SUI — incluindo Focal adhesion, ECM-receptor interaction e Regulation of actin cytoskeleton, todas reguladas para baixo nas duas condições. O achado mais robusto e replicado (queratinização/diferenciação epidérmica em POP) foi confirmado por múltiplas abordagens estatísticas e por um estudo publicado de terceiros. Todas as análises de vias biológicas usaram o fgsea, o pacote de referência da comunidade científica internacional para GSEA. As limitações identificadas são inerentes ao tipo de dado disponível (bulk, não single-cell) e ao tamanho amostral do estudo original de SUI — não a falhas na metodologia aplicada.</w:t>
       </w:r>
     </w:p>
     <w:p>

</xml_diff>